<commit_message>
docs: corrected data in proposal — real OJK stats, removed inflated claims, updated live stats endpoint
</commit_message>
<xml_diff>
--- a/JatuhTempo_KOMBAT_Proposal.docx
+++ b/JatuhTempo_KOMBAT_Proposal.docx
@@ -225,7 +225,7 @@
           <w:sz w:val="21"/>
           <w:szCs w:val="21"/>
         </w:rPr>
-        <w:t xml:space="preserve">Aplikasi ini sudah live di production (jatuhtempo.up.railway.app), memiliki 86 automated test yang passing, dan telah melalui audit keamanan dari dua AI model berbeda. JatuhTempo dikembangkan secara independen oleh FMA Software Labs sebagai kontribusi untuk mendukung gerakan literasi finansial dan kemerdekaan dari utang.</w:t>
+        <w:t xml:space="preserve">Aplikasi ini sudah live di production (jatuhtempo.up.railway.app), memiliki 86 automated test yang passing, dan telah melalui audit dari dua AI model berbeda untuk verifikasi kualitas kode dan keamanan.</w:t>
       </w:r>
     </w:p>
     <w:p>
@@ -244,7 +244,7 @@
           <w:sz w:val="21"/>
           <w:szCs w:val="21"/>
         </w:rPr>
-        <w:t xml:space="preserve">KOMBAT (Komunitas Bebas Utang) oleh Guru Gembul menemukan posisi yang tepat sebagai mitra alami JatuhTempo. Komunitas yang telah memiliki ribuan anggota yang sadar akan masalah utang dan ingin berubah adalah target market yang sempurna. JatuhTempo adalah alat digital yang selama ini tidak dimiliki oleh KOMBAT.</w:t>
+        <w:t xml:space="preserve">KOMBAT (Komunitas Bebas Utang) oleh Guru Gembul menemukan posisi yang tepat sebagai mitra alami JatuhTempo. Komunitas yang memiliki anggota yang sadar akan masalah utang dan ingin berubah adalah target market yang sempurna. JatuhTempo adalah alat digital yang selama ini tidak dimiliki oleh KOMBAT.</w:t>
       </w:r>
     </w:p>
     <w:p>
@@ -327,7 +327,43 @@
           <w:sz w:val="21"/>
           <w:szCs w:val="21"/>
         </w:rPr>
-        <w:t xml:space="preserve">Indonesia menghadapi krisis utang konsumtif yang senyap:</w:t>
+        <w:t xml:space="preserve">Berdasarkan data OJK (2025), outstanding pinjaman fintech lending di Indonesia mencapai Rp78,2 triliun dengan lebih dari 19 juta akun peminjam. Sementara itu, utang paylater tercatat Rp66 triliun pada 2024 dan terus bertumbuh setiap tahun.</w:t>
+      </w:r>
+    </w:p>
+    <w:p>
+      <w:pPr>
+        <w:spacing w:after="60"/>
+      </w:pPr>
+    </w:p>
+    <w:p>
+      <w:pPr>
+        <w:pStyle w:val="Heading2"/>
+        <w:spacing w:after="150" w:before="300"/>
+      </w:pPr>
+      <w:r>
+        <w:rPr>
+          <w:rFonts w:ascii="Arial" w:cs="Arial" w:eastAsia="Arial" w:hAnsi="Arial"/>
+          <w:b/>
+          <w:bCs/>
+          <w:color w:val="1E293B"/>
+          <w:sz w:val="26"/>
+          <w:szCs w:val="26"/>
+        </w:rPr>
+        <w:t xml:space="preserve">2.2 Kesenjangan Pasar</w:t>
+      </w:r>
+    </w:p>
+    <w:p>
+      <w:pPr>
+        <w:spacing w:after="120" w:line="276"/>
+      </w:pPr>
+      <w:r>
+        <w:rPr>
+          <w:rFonts w:ascii="Arial" w:cs="Arial" w:eastAsia="Arial" w:hAnsi="Arial"/>
+          <w:color w:val="1E293B"/>
+          <w:sz w:val="21"/>
+          <w:szCs w:val="21"/>
+        </w:rPr>
+        <w:t xml:space="preserve">Mayoritas aplikasi finansial global melakukan "tracking debt" — mencatat, tapi tidak membantu memberesi. Kombinasi yang JatuhTempo hadirkan belum ada di satu produk lain:</w:t>
       </w:r>
     </w:p>
     <w:p>
@@ -346,7 +382,7 @@
           <w:sz w:val="21"/>
           <w:szCs w:val="21"/>
         </w:rPr>
-        <w:t xml:space="preserve">67% orang Indonesia memiliki utang konsumtif (paylater, pinjol, kredit)</w:t>
+        <w:t xml:space="preserve">OCR screenshot tagihan: foto, AI baca otomatis platform, jumlah, tanggal, dan bunga</w:t>
       </w:r>
     </w:p>
     <w:p>
@@ -365,7 +401,7 @@
           <w:sz w:val="21"/>
           <w:szCs w:val="21"/>
         </w:rPr>
-        <w:t xml:space="preserve">Rata-rata orang memiliki 3-5 tagihan dengan jatuh tempo berbeda</w:t>
+        <w:t xml:space="preserve">Multi-platform: Telegram + Web + (segera) WhatsApp</w:t>
       </w:r>
     </w:p>
     <w:p>
@@ -384,7 +420,7 @@
           <w:sz w:val="21"/>
           <w:szCs w:val="21"/>
         </w:rPr>
-        <w:t xml:space="preserve">Tidak ada alat gratis berbahasa Indonesia yang mengintegrasikan semua utang dalam satu tempat</w:t>
+        <w:t xml:space="preserve">AI learning: makin pintar dengan setiap input user tanpa pelatihan ulang</w:t>
       </w:r>
     </w:p>
     <w:p>
@@ -403,119 +439,7 @@
           <w:sz w:val="21"/>
           <w:szCs w:val="21"/>
         </w:rPr>
-        <w:t xml:space="preserve">Debt collector &amp; spam call adalah sistem "pengingat" yang ada sekarang — datang saat sudah terlambat</w:t>
-      </w:r>
-    </w:p>
-    <w:p>
-      <w:pPr>
-        <w:spacing w:after="60"/>
-      </w:pPr>
-    </w:p>
-    <w:p>
-      <w:pPr>
-        <w:pStyle w:val="Heading2"/>
-        <w:spacing w:after="150" w:before="300"/>
-      </w:pPr>
-      <w:r>
-        <w:rPr>
-          <w:rFonts w:ascii="Arial" w:cs="Arial" w:eastAsia="Arial" w:hAnsi="Arial"/>
-          <w:b/>
-          <w:bCs/>
-          <w:color w:val="1E293B"/>
-          <w:sz w:val="26"/>
-          <w:szCs w:val="26"/>
-        </w:rPr>
-        <w:t xml:space="preserve">2.2 Kesenjangan Pasar</w:t>
-      </w:r>
-    </w:p>
-    <w:p>
-      <w:pPr>
-        <w:spacing w:after="120" w:line="276"/>
-      </w:pPr>
-      <w:r>
-        <w:rPr>
-          <w:rFonts w:ascii="Arial" w:cs="Arial" w:eastAsia="Arial" w:hAnsi="Arial"/>
-          <w:color w:val="1E293B"/>
-          <w:sz w:val="21"/>
-          <w:szCs w:val="21"/>
-        </w:rPr>
-        <w:t xml:space="preserve">Mayoritas aplikasi finansial global melakukan "tracking debt" — mencatat, tapi tidak membantu memberesi. Tidak ada satu pun yang menggabungkan:</w:t>
-      </w:r>
-    </w:p>
-    <w:p>
-      <w:pPr>
-        <w:pStyle w:val="ListParagraph"/>
-        <w:numPr>
-          <w:ilvl w:val="0"/>
-          <w:numId w:val="2"/>
-        </w:numPr>
-        <w:spacing w:after="60" w:line="276"/>
-      </w:pPr>
-      <w:r>
-        <w:rPr>
-          <w:rFonts w:ascii="Arial" w:cs="Arial" w:eastAsia="Arial" w:hAnsi="Arial"/>
-          <w:color w:val="1E293B"/>
-          <w:sz w:val="21"/>
-          <w:szCs w:val="21"/>
-        </w:rPr>
-        <w:t xml:space="preserve">OCR screenshot tagihan (foto, AI baca otomatis)</w:t>
-      </w:r>
-    </w:p>
-    <w:p>
-      <w:pPr>
-        <w:pStyle w:val="ListParagraph"/>
-        <w:numPr>
-          <w:ilvl w:val="0"/>
-          <w:numId w:val="2"/>
-        </w:numPr>
-        <w:spacing w:after="60" w:line="276"/>
-      </w:pPr>
-      <w:r>
-        <w:rPr>
-          <w:rFonts w:ascii="Arial" w:cs="Arial" w:eastAsia="Arial" w:hAnsi="Arial"/>
-          <w:color w:val="1E293B"/>
-          <w:sz w:val="21"/>
-          <w:szCs w:val="21"/>
-        </w:rPr>
-        <w:t xml:space="preserve">Multi-platform (Telegram + Web + WhatsApp)</w:t>
-      </w:r>
-    </w:p>
-    <w:p>
-      <w:pPr>
-        <w:pStyle w:val="ListParagraph"/>
-        <w:numPr>
-          <w:ilvl w:val="0"/>
-          <w:numId w:val="2"/>
-        </w:numPr>
-        <w:spacing w:after="60" w:line="276"/>
-      </w:pPr>
-      <w:r>
-        <w:rPr>
-          <w:rFonts w:ascii="Arial" w:cs="Arial" w:eastAsia="Arial" w:hAnsi="Arial"/>
-          <w:color w:val="1E293B"/>
-          <w:sz w:val="21"/>
-          <w:szCs w:val="21"/>
-        </w:rPr>
-        <w:t xml:space="preserve">AI learning yang makin pintar dengan setiap input user</w:t>
-      </w:r>
-    </w:p>
-    <w:p>
-      <w:pPr>
-        <w:pStyle w:val="ListParagraph"/>
-        <w:numPr>
-          <w:ilvl w:val="0"/>
-          <w:numId w:val="2"/>
-        </w:numPr>
-        <w:spacing w:after="60" w:line="276"/>
-      </w:pPr>
-      <w:r>
-        <w:rPr>
-          <w:rFonts w:ascii="Arial" w:cs="Arial" w:eastAsia="Arial" w:hAnsi="Arial"/>
-          <w:color w:val="1E293B"/>
-          <w:sz w:val="21"/>
-          <w:szCs w:val="21"/>
-        </w:rPr>
-        <w:t xml:space="preserve">Opportunity Network yang menghubungkan anggota komunitas dengan peluang nyata</w:t>
+        <w:t xml:space="preserve">Opportunity Network: menghubungkan anggota komunitas dengan peluang penghasilan</w:t>
       </w:r>
     </w:p>
     <w:p>
@@ -744,7 +668,7 @@
                 <w:sz w:val="21"/>
                 <w:szCs w:val="21"/>
               </w:rPr>
-              <w:t xml:space="preserve">Upload tagihan, AI (DeepSeek) ekstrak platform, jumlah, tanggal, bunga, cicilan otomatis. Akurasi 95%+.</w:t>
+              <w:t xml:space="preserve">Upload tagihan, AI (DeepSeek) ekstrak platform, jumlah, tanggal, bunga, cicilan otomatis.</w:t>
             </w:r>
           </w:p>
         </w:tc>
@@ -5108,8 +5032,9 @@
       </w:tblPr>
       <w:tblGrid>
         <w:gridCol w:w="2500"/>
-        <w:gridCol w:w="3430"/>
-        <w:gridCol w:w="3430"/>
+        <w:gridCol w:w="2300"/>
+        <w:gridCol w:w="2300"/>
+        <w:gridCol w:w="2260"/>
       </w:tblGrid>
       <w:tr>
         <w:tc>
@@ -5149,7 +5074,7 @@
         </w:tc>
         <w:tc>
           <w:tcPr>
-            <w:tcW w:type="dxa" w:w="3430"/>
+            <w:tcW w:type="dxa" w:w="2300"/>
             <w:tcBorders>
               <w:top w:val="single" w:color="E2E8F0" w:sz="1"/>
               <w:left w:val="single" w:color="E2E8F0" w:sz="1"/>
@@ -5184,14 +5109,14 @@
         </w:tc>
         <w:tc>
           <w:tcPr>
-            <w:tcW w:type="dxa" w:w="3430"/>
-            <w:tcBorders>
-              <w:top w:val="single" w:color="E2E8F0" w:sz="1"/>
-              <w:left w:val="single" w:color="E2E8F0" w:sz="1"/>
-              <w:bottom w:val="single" w:color="E2E8F0" w:sz="1"/>
-              <w:right w:val="single" w:color="E2E8F0" w:sz="1"/>
-            </w:tcBorders>
-            <w:shd w:fill="0D9488" w:val="clear"/>
+            <w:tcW w:type="dxa" w:w="2300"/>
+            <w:tcBorders>
+              <w:top w:val="single" w:color="E2E8F0" w:sz="1"/>
+              <w:left w:val="single" w:color="E2E8F0" w:sz="1"/>
+              <w:bottom w:val="single" w:color="E2E8F0" w:sz="1"/>
+              <w:right w:val="single" w:color="E2E8F0" w:sz="1"/>
+            </w:tcBorders>
+            <w:shd w:fill="0F766E" w:val="clear"/>
             <w:tcMar>
               <w:top w:type="dxa" w:w="60"/>
               <w:left w:type="dxa" w:w="100"/>
@@ -5213,6 +5138,41 @@
                 <w:sz w:val="21"/>
                 <w:szCs w:val="21"/>
               </w:rPr>
+              <w:t xml:space="preserve">KOMBAT</w:t>
+            </w:r>
+          </w:p>
+        </w:tc>
+        <w:tc>
+          <w:tcPr>
+            <w:tcW w:type="dxa" w:w="2260"/>
+            <w:tcBorders>
+              <w:top w:val="single" w:color="E2E8F0" w:sz="1"/>
+              <w:left w:val="single" w:color="E2E8F0" w:sz="1"/>
+              <w:bottom w:val="single" w:color="E2E8F0" w:sz="1"/>
+              <w:right w:val="single" w:color="E2E8F0" w:sz="1"/>
+            </w:tcBorders>
+            <w:shd w:fill="0D9488" w:val="clear"/>
+            <w:tcMar>
+              <w:top w:type="dxa" w:w="60"/>
+              <w:left w:type="dxa" w:w="100"/>
+              <w:bottom w:type="dxa" w:w="60"/>
+              <w:right w:type="dxa" w:w="100"/>
+            </w:tcMar>
+            <w:vAlign w:val="center"/>
+          </w:tcPr>
+          <w:p>
+            <w:pPr>
+              <w:spacing w:after="120" w:line="276"/>
+            </w:pPr>
+            <w:r>
+              <w:rPr>
+                <w:rFonts w:ascii="Arial" w:cs="Arial" w:eastAsia="Arial" w:hAnsi="Arial"/>
+                <w:b/>
+                <w:bCs/>
+                <w:color w:val="FFFFFF"/>
+                <w:sz w:val="21"/>
+                <w:szCs w:val="21"/>
+              </w:rPr>
               <w:t xml:space="preserve">Pro</w:t>
             </w:r>
           </w:p>
@@ -5256,65 +5216,98 @@
         </w:tc>
         <w:tc>
           <w:tcPr>
-            <w:tcW w:type="dxa" w:w="3430"/>
-            <w:tcBorders>
-              <w:top w:val="single" w:color="E2E8F0" w:sz="1"/>
-              <w:left w:val="single" w:color="E2E8F0" w:sz="1"/>
-              <w:bottom w:val="single" w:color="E2E8F0" w:sz="1"/>
-              <w:right w:val="single" w:color="E2E8F0" w:sz="1"/>
-            </w:tcBorders>
-            <w:tcMar>
-              <w:top w:type="dxa" w:w="60"/>
-              <w:left w:type="dxa" w:w="100"/>
-              <w:bottom w:type="dxa" w:w="60"/>
-              <w:right w:type="dxa" w:w="100"/>
-            </w:tcMar>
-            <w:vAlign w:val="center"/>
-          </w:tcPr>
-          <w:p>
-            <w:pPr>
-              <w:spacing w:after="120" w:line="276"/>
-            </w:pPr>
-            <w:r>
-              <w:rPr>
-                <w:rFonts w:ascii="Arial" w:cs="Arial" w:eastAsia="Arial" w:hAnsi="Arial"/>
-                <w:color w:val="1E293B"/>
-                <w:sz w:val="21"/>
-                <w:szCs w:val="21"/>
-              </w:rPr>
-              <w:t xml:space="preserve">Gratis selamanya</w:t>
-            </w:r>
-          </w:p>
-        </w:tc>
-        <w:tc>
-          <w:tcPr>
-            <w:tcW w:type="dxa" w:w="3430"/>
-            <w:tcBorders>
-              <w:top w:val="single" w:color="E2E8F0" w:sz="1"/>
-              <w:left w:val="single" w:color="E2E8F0" w:sz="1"/>
-              <w:bottom w:val="single" w:color="E2E8F0" w:sz="1"/>
-              <w:right w:val="single" w:color="E2E8F0" w:sz="1"/>
-            </w:tcBorders>
-            <w:tcMar>
-              <w:top w:type="dxa" w:w="60"/>
-              <w:left w:type="dxa" w:w="100"/>
-              <w:bottom w:type="dxa" w:w="60"/>
-              <w:right w:type="dxa" w:w="100"/>
-            </w:tcMar>
-            <w:vAlign w:val="center"/>
-          </w:tcPr>
-          <w:p>
-            <w:pPr>
-              <w:spacing w:after="120" w:line="276"/>
-            </w:pPr>
-            <w:r>
-              <w:rPr>
-                <w:rFonts w:ascii="Arial" w:cs="Arial" w:eastAsia="Arial" w:hAnsi="Arial"/>
-                <w:color w:val="1E293B"/>
-                <w:sz w:val="21"/>
-                <w:szCs w:val="21"/>
-              </w:rPr>
-              <w:t xml:space="preserve">Rp 35rb/bulan (estimasi)</w:t>
+            <w:tcW w:type="dxa" w:w="2300"/>
+            <w:tcBorders>
+              <w:top w:val="single" w:color="E2E8F0" w:sz="1"/>
+              <w:left w:val="single" w:color="E2E8F0" w:sz="1"/>
+              <w:bottom w:val="single" w:color="E2E8F0" w:sz="1"/>
+              <w:right w:val="single" w:color="E2E8F0" w:sz="1"/>
+            </w:tcBorders>
+            <w:tcMar>
+              <w:top w:type="dxa" w:w="60"/>
+              <w:left w:type="dxa" w:w="100"/>
+              <w:bottom w:type="dxa" w:w="60"/>
+              <w:right w:type="dxa" w:w="100"/>
+            </w:tcMar>
+            <w:vAlign w:val="center"/>
+          </w:tcPr>
+          <w:p>
+            <w:pPr>
+              <w:spacing w:after="120" w:line="276"/>
+            </w:pPr>
+            <w:r>
+              <w:rPr>
+                <w:rFonts w:ascii="Arial" w:cs="Arial" w:eastAsia="Arial" w:hAnsi="Arial"/>
+                <w:color w:val="1E293B"/>
+                <w:sz w:val="21"/>
+                <w:szCs w:val="21"/>
+              </w:rPr>
+              <w:t xml:space="preserve">Gratis</w:t>
+            </w:r>
+          </w:p>
+        </w:tc>
+        <w:tc>
+          <w:tcPr>
+            <w:tcW w:type="dxa" w:w="2300"/>
+            <w:tcBorders>
+              <w:top w:val="single" w:color="E2E8F0" w:sz="1"/>
+              <w:left w:val="single" w:color="E2E8F0" w:sz="1"/>
+              <w:bottom w:val="single" w:color="E2E8F0" w:sz="1"/>
+              <w:right w:val="single" w:color="E2E8F0" w:sz="1"/>
+            </w:tcBorders>
+            <w:shd w:fill="F0FDFA" w:val="clear"/>
+            <w:tcMar>
+              <w:top w:type="dxa" w:w="60"/>
+              <w:left w:type="dxa" w:w="100"/>
+              <w:bottom w:type="dxa" w:w="60"/>
+              <w:right w:type="dxa" w:w="100"/>
+            </w:tcMar>
+            <w:vAlign w:val="center"/>
+          </w:tcPr>
+          <w:p>
+            <w:pPr>
+              <w:spacing w:after="120" w:line="276"/>
+            </w:pPr>
+            <w:r>
+              <w:rPr>
+                <w:rFonts w:ascii="Arial" w:cs="Arial" w:eastAsia="Arial" w:hAnsi="Arial"/>
+                <w:color w:val="1E293B"/>
+                <w:sz w:val="21"/>
+                <w:szCs w:val="21"/>
+              </w:rPr>
+              <w:t xml:space="preserve">Gratis</w:t>
+            </w:r>
+          </w:p>
+        </w:tc>
+        <w:tc>
+          <w:tcPr>
+            <w:tcW w:type="dxa" w:w="2260"/>
+            <w:tcBorders>
+              <w:top w:val="single" w:color="E2E8F0" w:sz="1"/>
+              <w:left w:val="single" w:color="E2E8F0" w:sz="1"/>
+              <w:bottom w:val="single" w:color="E2E8F0" w:sz="1"/>
+              <w:right w:val="single" w:color="E2E8F0" w:sz="1"/>
+            </w:tcBorders>
+            <w:tcMar>
+              <w:top w:type="dxa" w:w="60"/>
+              <w:left w:type="dxa" w:w="100"/>
+              <w:bottom w:type="dxa" w:w="60"/>
+              <w:right w:type="dxa" w:w="100"/>
+            </w:tcMar>
+            <w:vAlign w:val="center"/>
+          </w:tcPr>
+          <w:p>
+            <w:pPr>
+              <w:spacing w:after="120" w:line="276"/>
+            </w:pPr>
+            <w:r>
+              <w:rPr>
+                <w:rFonts w:ascii="Arial" w:cs="Arial" w:eastAsia="Arial" w:hAnsi="Arial"/>
+                <w:color w:val="1E293B"/>
+                <w:sz w:val="21"/>
+                <w:szCs w:val="21"/>
+              </w:rPr>
+              <w:t xml:space="preserve">Rp35rb/bln</w:t>
             </w:r>
           </w:p>
         </w:tc>
@@ -5357,39 +5350,72 @@
         </w:tc>
         <w:tc>
           <w:tcPr>
-            <w:tcW w:type="dxa" w:w="3430"/>
-            <w:tcBorders>
-              <w:top w:val="single" w:color="E2E8F0" w:sz="1"/>
-              <w:left w:val="single" w:color="E2E8F0" w:sz="1"/>
-              <w:bottom w:val="single" w:color="E2E8F0" w:sz="1"/>
-              <w:right w:val="single" w:color="E2E8F0" w:sz="1"/>
-            </w:tcBorders>
-            <w:tcMar>
-              <w:top w:type="dxa" w:w="60"/>
-              <w:left w:type="dxa" w:w="100"/>
-              <w:bottom w:type="dxa" w:w="60"/>
-              <w:right w:type="dxa" w:w="100"/>
-            </w:tcMar>
-            <w:vAlign w:val="center"/>
-          </w:tcPr>
-          <w:p>
-            <w:pPr>
-              <w:spacing w:after="120" w:line="276"/>
-            </w:pPr>
-            <w:r>
-              <w:rPr>
-                <w:rFonts w:ascii="Arial" w:cs="Arial" w:eastAsia="Arial" w:hAnsi="Arial"/>
-                <w:color w:val="1E293B"/>
-                <w:sz w:val="21"/>
-                <w:szCs w:val="21"/>
-              </w:rPr>
-              <w:t xml:space="preserve">Maksimal 5</w:t>
-            </w:r>
-          </w:p>
-        </w:tc>
-        <w:tc>
-          <w:tcPr>
-            <w:tcW w:type="dxa" w:w="3430"/>
+            <w:tcW w:type="dxa" w:w="2300"/>
+            <w:tcBorders>
+              <w:top w:val="single" w:color="E2E8F0" w:sz="1"/>
+              <w:left w:val="single" w:color="E2E8F0" w:sz="1"/>
+              <w:bottom w:val="single" w:color="E2E8F0" w:sz="1"/>
+              <w:right w:val="single" w:color="E2E8F0" w:sz="1"/>
+            </w:tcBorders>
+            <w:tcMar>
+              <w:top w:type="dxa" w:w="60"/>
+              <w:left w:type="dxa" w:w="100"/>
+              <w:bottom w:type="dxa" w:w="60"/>
+              <w:right w:type="dxa" w:w="100"/>
+            </w:tcMar>
+            <w:vAlign w:val="center"/>
+          </w:tcPr>
+          <w:p>
+            <w:pPr>
+              <w:spacing w:after="120" w:line="276"/>
+            </w:pPr>
+            <w:r>
+              <w:rPr>
+                <w:rFonts w:ascii="Arial" w:cs="Arial" w:eastAsia="Arial" w:hAnsi="Arial"/>
+                <w:color w:val="1E293B"/>
+                <w:sz w:val="21"/>
+                <w:szCs w:val="21"/>
+              </w:rPr>
+              <w:t xml:space="preserve">Max 5</w:t>
+            </w:r>
+          </w:p>
+        </w:tc>
+        <w:tc>
+          <w:tcPr>
+            <w:tcW w:type="dxa" w:w="2300"/>
+            <w:tcBorders>
+              <w:top w:val="single" w:color="E2E8F0" w:sz="1"/>
+              <w:left w:val="single" w:color="E2E8F0" w:sz="1"/>
+              <w:bottom w:val="single" w:color="E2E8F0" w:sz="1"/>
+              <w:right w:val="single" w:color="E2E8F0" w:sz="1"/>
+            </w:tcBorders>
+            <w:shd w:fill="F0FDFA" w:val="clear"/>
+            <w:tcMar>
+              <w:top w:type="dxa" w:w="60"/>
+              <w:left w:type="dxa" w:w="100"/>
+              <w:bottom w:type="dxa" w:w="60"/>
+              <w:right w:type="dxa" w:w="100"/>
+            </w:tcMar>
+            <w:vAlign w:val="center"/>
+          </w:tcPr>
+          <w:p>
+            <w:pPr>
+              <w:spacing w:after="120" w:line="276"/>
+            </w:pPr>
+            <w:r>
+              <w:rPr>
+                <w:rFonts w:ascii="Arial" w:cs="Arial" w:eastAsia="Arial" w:hAnsi="Arial"/>
+                <w:color w:val="1E293B"/>
+                <w:sz w:val="21"/>
+                <w:szCs w:val="21"/>
+              </w:rPr>
+              <w:t xml:space="preserve">Max 15</w:t>
+            </w:r>
+          </w:p>
+        </w:tc>
+        <w:tc>
+          <w:tcPr>
+            <w:tcW w:type="dxa" w:w="2260"/>
             <w:tcBorders>
               <w:top w:val="single" w:color="E2E8F0" w:sz="1"/>
               <w:left w:val="single" w:color="E2E8F0" w:sz="1"/>
@@ -5458,7 +5484,7 @@
         </w:tc>
         <w:tc>
           <w:tcPr>
-            <w:tcW w:type="dxa" w:w="3430"/>
+            <w:tcW w:type="dxa" w:w="2300"/>
             <w:tcBorders>
               <w:top w:val="single" w:color="E2E8F0" w:sz="1"/>
               <w:left w:val="single" w:color="E2E8F0" w:sz="1"/>
@@ -5490,33 +5516,66 @@
         </w:tc>
         <w:tc>
           <w:tcPr>
-            <w:tcW w:type="dxa" w:w="3430"/>
-            <w:tcBorders>
-              <w:top w:val="single" w:color="E2E8F0" w:sz="1"/>
-              <w:left w:val="single" w:color="E2E8F0" w:sz="1"/>
-              <w:bottom w:val="single" w:color="E2E8F0" w:sz="1"/>
-              <w:right w:val="single" w:color="E2E8F0" w:sz="1"/>
-            </w:tcBorders>
-            <w:tcMar>
-              <w:top w:type="dxa" w:w="60"/>
-              <w:left w:type="dxa" w:w="100"/>
-              <w:bottom w:type="dxa" w:w="60"/>
-              <w:right w:type="dxa" w:w="100"/>
-            </w:tcMar>
-            <w:vAlign w:val="center"/>
-          </w:tcPr>
-          <w:p>
-            <w:pPr>
-              <w:spacing w:after="120" w:line="276"/>
-            </w:pPr>
-            <w:r>
-              <w:rPr>
-                <w:rFonts w:ascii="Arial" w:cs="Arial" w:eastAsia="Arial" w:hAnsi="Arial"/>
-                <w:color w:val="1E293B"/>
-                <w:sz w:val="21"/>
-                <w:szCs w:val="21"/>
-              </w:rPr>
-              <w:t xml:space="preserve">Unlimited priority</w:t>
+            <w:tcW w:type="dxa" w:w="2300"/>
+            <w:tcBorders>
+              <w:top w:val="single" w:color="E2E8F0" w:sz="1"/>
+              <w:left w:val="single" w:color="E2E8F0" w:sz="1"/>
+              <w:bottom w:val="single" w:color="E2E8F0" w:sz="1"/>
+              <w:right w:val="single" w:color="E2E8F0" w:sz="1"/>
+            </w:tcBorders>
+            <w:shd w:fill="F0FDFA" w:val="clear"/>
+            <w:tcMar>
+              <w:top w:type="dxa" w:w="60"/>
+              <w:left w:type="dxa" w:w="100"/>
+              <w:bottom w:type="dxa" w:w="60"/>
+              <w:right w:type="dxa" w:w="100"/>
+            </w:tcMar>
+            <w:vAlign w:val="center"/>
+          </w:tcPr>
+          <w:p>
+            <w:pPr>
+              <w:spacing w:after="120" w:line="276"/>
+            </w:pPr>
+            <w:r>
+              <w:rPr>
+                <w:rFonts w:ascii="Arial" w:cs="Arial" w:eastAsia="Arial" w:hAnsi="Arial"/>
+                <w:color w:val="1E293B"/>
+                <w:sz w:val="21"/>
+                <w:szCs w:val="21"/>
+              </w:rPr>
+              <w:t xml:space="preserve">Prioritas</w:t>
+            </w:r>
+          </w:p>
+        </w:tc>
+        <w:tc>
+          <w:tcPr>
+            <w:tcW w:type="dxa" w:w="2260"/>
+            <w:tcBorders>
+              <w:top w:val="single" w:color="E2E8F0" w:sz="1"/>
+              <w:left w:val="single" w:color="E2E8F0" w:sz="1"/>
+              <w:bottom w:val="single" w:color="E2E8F0" w:sz="1"/>
+              <w:right w:val="single" w:color="E2E8F0" w:sz="1"/>
+            </w:tcBorders>
+            <w:tcMar>
+              <w:top w:type="dxa" w:w="60"/>
+              <w:left w:type="dxa" w:w="100"/>
+              <w:bottom w:type="dxa" w:w="60"/>
+              <w:right w:type="dxa" w:w="100"/>
+            </w:tcMar>
+            <w:vAlign w:val="center"/>
+          </w:tcPr>
+          <w:p>
+            <w:pPr>
+              <w:spacing w:after="120" w:line="276"/>
+            </w:pPr>
+            <w:r>
+              <w:rPr>
+                <w:rFonts w:ascii="Arial" w:cs="Arial" w:eastAsia="Arial" w:hAnsi="Arial"/>
+                <w:color w:val="1E293B"/>
+                <w:sz w:val="21"/>
+                <w:szCs w:val="21"/>
+              </w:rPr>
+              <w:t xml:space="preserve">Prioritas + WA</w:t>
             </w:r>
           </w:p>
         </w:tc>
@@ -5559,7 +5618,7 @@
         </w:tc>
         <w:tc>
           <w:tcPr>
-            <w:tcW w:type="dxa" w:w="3430"/>
+            <w:tcW w:type="dxa" w:w="2300"/>
             <w:tcBorders>
               <w:top w:val="single" w:color="E2E8F0" w:sz="1"/>
               <w:left w:val="single" w:color="E2E8F0" w:sz="1"/>
@@ -5591,33 +5650,66 @@
         </w:tc>
         <w:tc>
           <w:tcPr>
-            <w:tcW w:type="dxa" w:w="3430"/>
-            <w:tcBorders>
-              <w:top w:val="single" w:color="E2E8F0" w:sz="1"/>
-              <w:left w:val="single" w:color="E2E8F0" w:sz="1"/>
-              <w:bottom w:val="single" w:color="E2E8F0" w:sz="1"/>
-              <w:right w:val="single" w:color="E2E8F0" w:sz="1"/>
-            </w:tcBorders>
-            <w:tcMar>
-              <w:top w:type="dxa" w:w="60"/>
-              <w:left w:type="dxa" w:w="100"/>
-              <w:bottom w:type="dxa" w:w="60"/>
-              <w:right w:type="dxa" w:w="100"/>
-            </w:tcMar>
-            <w:vAlign w:val="center"/>
-          </w:tcPr>
-          <w:p>
-            <w:pPr>
-              <w:spacing w:after="120" w:line="276"/>
-            </w:pPr>
-            <w:r>
-              <w:rPr>
-                <w:rFonts w:ascii="Arial" w:cs="Arial" w:eastAsia="Arial" w:hAnsi="Arial"/>
-                <w:color w:val="1E293B"/>
-                <w:sz w:val="21"/>
-                <w:szCs w:val="21"/>
-              </w:rPr>
-              <w:t xml:space="preserve">Telegram + WA (coming)</w:t>
+            <w:tcW w:type="dxa" w:w="2300"/>
+            <w:tcBorders>
+              <w:top w:val="single" w:color="E2E8F0" w:sz="1"/>
+              <w:left w:val="single" w:color="E2E8F0" w:sz="1"/>
+              <w:bottom w:val="single" w:color="E2E8F0" w:sz="1"/>
+              <w:right w:val="single" w:color="E2E8F0" w:sz="1"/>
+            </w:tcBorders>
+            <w:shd w:fill="F0FDFA" w:val="clear"/>
+            <w:tcMar>
+              <w:top w:type="dxa" w:w="60"/>
+              <w:left w:type="dxa" w:w="100"/>
+              <w:bottom w:type="dxa" w:w="60"/>
+              <w:right w:type="dxa" w:w="100"/>
+            </w:tcMar>
+            <w:vAlign w:val="center"/>
+          </w:tcPr>
+          <w:p>
+            <w:pPr>
+              <w:spacing w:after="120" w:line="276"/>
+            </w:pPr>
+            <w:r>
+              <w:rPr>
+                <w:rFonts w:ascii="Arial" w:cs="Arial" w:eastAsia="Arial" w:hAnsi="Arial"/>
+                <w:color w:val="1E293B"/>
+                <w:sz w:val="21"/>
+                <w:szCs w:val="21"/>
+              </w:rPr>
+              <w:t xml:space="preserve">Telegram</w:t>
+            </w:r>
+          </w:p>
+        </w:tc>
+        <w:tc>
+          <w:tcPr>
+            <w:tcW w:type="dxa" w:w="2260"/>
+            <w:tcBorders>
+              <w:top w:val="single" w:color="E2E8F0" w:sz="1"/>
+              <w:left w:val="single" w:color="E2E8F0" w:sz="1"/>
+              <w:bottom w:val="single" w:color="E2E8F0" w:sz="1"/>
+              <w:right w:val="single" w:color="E2E8F0" w:sz="1"/>
+            </w:tcBorders>
+            <w:tcMar>
+              <w:top w:type="dxa" w:w="60"/>
+              <w:left w:type="dxa" w:w="100"/>
+              <w:bottom w:type="dxa" w:w="60"/>
+              <w:right w:type="dxa" w:w="100"/>
+            </w:tcMar>
+            <w:vAlign w:val="center"/>
+          </w:tcPr>
+          <w:p>
+            <w:pPr>
+              <w:spacing w:after="120" w:line="276"/>
+            </w:pPr>
+            <w:r>
+              <w:rPr>
+                <w:rFonts w:ascii="Arial" w:cs="Arial" w:eastAsia="Arial" w:hAnsi="Arial"/>
+                <w:color w:val="1E293B"/>
+                <w:sz w:val="21"/>
+                <w:szCs w:val="21"/>
+              </w:rPr>
+              <w:t xml:space="preserve">Telegram + WA</w:t>
             </w:r>
           </w:p>
         </w:tc>
@@ -5660,7 +5752,7 @@
         </w:tc>
         <w:tc>
           <w:tcPr>
-            <w:tcW w:type="dxa" w:w="3430"/>
+            <w:tcW w:type="dxa" w:w="2300"/>
             <w:tcBorders>
               <w:top w:val="single" w:color="E2E8F0" w:sz="1"/>
               <w:left w:val="single" w:color="E2E8F0" w:sz="1"/>
@@ -5692,7 +5784,40 @@
         </w:tc>
         <w:tc>
           <w:tcPr>
-            <w:tcW w:type="dxa" w:w="3430"/>
+            <w:tcW w:type="dxa" w:w="2300"/>
+            <w:tcBorders>
+              <w:top w:val="single" w:color="E2E8F0" w:sz="1"/>
+              <w:left w:val="single" w:color="E2E8F0" w:sz="1"/>
+              <w:bottom w:val="single" w:color="E2E8F0" w:sz="1"/>
+              <w:right w:val="single" w:color="E2E8F0" w:sz="1"/>
+            </w:tcBorders>
+            <w:shd w:fill="F0FDFA" w:val="clear"/>
+            <w:tcMar>
+              <w:top w:type="dxa" w:w="60"/>
+              <w:left w:type="dxa" w:w="100"/>
+              <w:bottom w:type="dxa" w:w="60"/>
+              <w:right w:type="dxa" w:w="100"/>
+            </w:tcMar>
+            <w:vAlign w:val="center"/>
+          </w:tcPr>
+          <w:p>
+            <w:pPr>
+              <w:spacing w:after="120" w:line="276"/>
+            </w:pPr>
+            <w:r>
+              <w:rPr>
+                <w:rFonts w:ascii="Arial" w:cs="Arial" w:eastAsia="Arial" w:hAnsi="Arial"/>
+                <w:color w:val="1E293B"/>
+                <w:sz w:val="21"/>
+                <w:szCs w:val="21"/>
+              </w:rPr>
+              <w:t xml:space="preserve">CSV</w:t>
+            </w:r>
+          </w:p>
+        </w:tc>
+        <w:tc>
+          <w:tcPr>
+            <w:tcW w:type="dxa" w:w="2260"/>
             <w:tcBorders>
               <w:top w:val="single" w:color="E2E8F0" w:sz="1"/>
               <w:left w:val="single" w:color="E2E8F0" w:sz="1"/>
@@ -5755,13 +5880,13 @@
                 <w:sz w:val="21"/>
                 <w:szCs w:val="21"/>
               </w:rPr>
-              <w:t xml:space="preserve">Opportunity Network</w:t>
-            </w:r>
-          </w:p>
-        </w:tc>
-        <w:tc>
-          <w:tcPr>
-            <w:tcW w:type="dxa" w:w="3430"/>
+              <w:t xml:space="preserve">Opportunity</w:t>
+            </w:r>
+          </w:p>
+        </w:tc>
+        <w:tc>
+          <w:tcPr>
+            <w:tcW w:type="dxa" w:w="2300"/>
             <w:tcBorders>
               <w:top w:val="single" w:color="E2E8F0" w:sz="1"/>
               <w:left w:val="single" w:color="E2E8F0" w:sz="1"/>
@@ -5793,7 +5918,40 @@
         </w:tc>
         <w:tc>
           <w:tcPr>
-            <w:tcW w:type="dxa" w:w="3430"/>
+            <w:tcW w:type="dxa" w:w="2300"/>
+            <w:tcBorders>
+              <w:top w:val="single" w:color="E2E8F0" w:sz="1"/>
+              <w:left w:val="single" w:color="E2E8F0" w:sz="1"/>
+              <w:bottom w:val="single" w:color="E2E8F0" w:sz="1"/>
+              <w:right w:val="single" w:color="E2E8F0" w:sz="1"/>
+            </w:tcBorders>
+            <w:shd w:fill="F0FDFA" w:val="clear"/>
+            <w:tcMar>
+              <w:top w:type="dxa" w:w="60"/>
+              <w:left w:type="dxa" w:w="100"/>
+              <w:bottom w:type="dxa" w:w="60"/>
+              <w:right w:type="dxa" w:w="100"/>
+            </w:tcMar>
+            <w:vAlign w:val="center"/>
+          </w:tcPr>
+          <w:p>
+            <w:pPr>
+              <w:spacing w:after="120" w:line="276"/>
+            </w:pPr>
+            <w:r>
+              <w:rPr>
+                <w:rFonts w:ascii="Arial" w:cs="Arial" w:eastAsia="Arial" w:hAnsi="Arial"/>
+                <w:color w:val="1E293B"/>
+                <w:sz w:val="21"/>
+                <w:szCs w:val="21"/>
+              </w:rPr>
+              <w:t xml:space="preserve">Akses penuh</w:t>
+            </w:r>
+          </w:p>
+        </w:tc>
+        <w:tc>
+          <w:tcPr>
+            <w:tcW w:type="dxa" w:w="2260"/>
             <w:tcBorders>
               <w:top w:val="single" w:color="E2E8F0" w:sz="1"/>
               <w:left w:val="single" w:color="E2E8F0" w:sz="1"/>
@@ -5841,65 +5999,7 @@
           <w:sz w:val="21"/>
           <w:szCs w:val="21"/>
         </w:rPr>
-        <w:t xml:space="preserve">Revenue dari Pro akan digunakan untuk: biaya server, API DeepSeek, pengembangan fitur baru. Tidak ada iklan, tidak ada penjualan data pengguna.</w:t>
-      </w:r>
-    </w:p>
-    <w:p>
-      <w:r>
-        <w:br w:type="page"/>
-      </w:r>
-    </w:p>
-    <w:p>
-      <w:pPr>
-        <w:pStyle w:val="Heading1"/>
-        <w:spacing w:after="200" w:before="400"/>
-      </w:pPr>
-      <w:r>
-        <w:rPr>
-          <w:rFonts w:ascii="Arial" w:cs="Arial" w:eastAsia="Arial" w:hAnsi="Arial"/>
-          <w:b/>
-          <w:bCs/>
-          <w:color w:val="0F766E"/>
-          <w:sz w:val="32"/>
-          <w:szCs w:val="32"/>
-        </w:rPr>
-        <w:t xml:space="preserve">8. Proposal Kolaborasi</w:t>
-      </w:r>
-    </w:p>
-    <w:p>
-      <w:pPr>
-        <w:spacing w:after="120" w:line="276"/>
-      </w:pPr>
-      <w:r>
-        <w:rPr>
-          <w:rFonts w:ascii="Arial" w:cs="Arial" w:eastAsia="Arial" w:hAnsi="Arial"/>
-          <w:color w:val="1E293B"/>
-          <w:sz w:val="21"/>
-          <w:szCs w:val="21"/>
-        </w:rPr>
-        <w:t xml:space="preserve">Dengan ini, saya menawarkan JatuhTempo sebagai platform digital resmi untuk KOMBAT. Saya membangun ini sendiri, dengan kemampuan dan biaya saya sendiri, untuk mendukung program mulia yang sedang Bapak perjuangkan.</w:t>
-      </w:r>
-    </w:p>
-    <w:p>
-      <w:pPr>
-        <w:spacing w:after="60"/>
-      </w:pPr>
-    </w:p>
-    <w:p>
-      <w:pPr>
-        <w:pStyle w:val="Heading2"/>
-        <w:spacing w:after="150" w:before="300"/>
-      </w:pPr>
-      <w:r>
-        <w:rPr>
-          <w:rFonts w:ascii="Arial" w:cs="Arial" w:eastAsia="Arial" w:hAnsi="Arial"/>
-          <w:b/>
-          <w:bCs/>
-          <w:color w:val="1E293B"/>
-          <w:sz w:val="26"/>
-          <w:szCs w:val="26"/>
-        </w:rPr>
-        <w:t xml:space="preserve">Yang Saya Tawarkan</w:t>
+        <w:t xml:space="preserve">Model bisnis dirancang agar anggota KOMBAT tidak pernah dipungut biaya. Revenue diperoleh dari:</w:t>
       </w:r>
     </w:p>
     <w:p>
@@ -5918,7 +6018,138 @@
           <w:sz w:val="21"/>
           <w:szCs w:val="21"/>
         </w:rPr>
-        <w:t xml:space="preserve">Akses penuh JatuhTempo untuk seluruh anggota KOMBAT secara gratis selama-lamanya</w:t>
+        <w:t xml:space="preserve">Verified Badge untuk pemberi peluang (Opportunity Network) — mereka yang memiliki bisnis dan ingin membantu</w:t>
+      </w:r>
+    </w:p>
+    <w:p>
+      <w:pPr>
+        <w:pStyle w:val="ListParagraph"/>
+        <w:numPr>
+          <w:ilvl w:val="0"/>
+          <w:numId w:val="2"/>
+        </w:numPr>
+        <w:spacing w:after="60" w:line="276"/>
+      </w:pPr>
+      <w:r>
+        <w:rPr>
+          <w:rFonts w:ascii="Arial" w:cs="Arial" w:eastAsia="Arial" w:hAnsi="Arial"/>
+          <w:color w:val="1E293B"/>
+          <w:sz w:val="21"/>
+          <w:szCs w:val="21"/>
+        </w:rPr>
+        <w:t xml:space="preserve">Referral fee opsional — hanya jika anggota berhasil mendapatkan penghasilan lewat platform</w:t>
+      </w:r>
+    </w:p>
+    <w:p>
+      <w:pPr>
+        <w:pStyle w:val="ListParagraph"/>
+        <w:numPr>
+          <w:ilvl w:val="0"/>
+          <w:numId w:val="2"/>
+        </w:numPr>
+        <w:spacing w:after="60" w:line="276"/>
+      </w:pPr>
+      <w:r>
+        <w:rPr>
+          <w:rFonts w:ascii="Arial" w:cs="Arial" w:eastAsia="Arial" w:hAnsi="Arial"/>
+          <w:color w:val="1E293B"/>
+          <w:sz w:val="21"/>
+          <w:szCs w:val="21"/>
+        </w:rPr>
+        <w:t xml:space="preserve">Pro subscription — untuk power user yang membutuhkan fitur unlimited</w:t>
+      </w:r>
+    </w:p>
+    <w:p>
+      <w:pPr>
+        <w:spacing w:after="120" w:line="276"/>
+      </w:pPr>
+      <w:r>
+        <w:rPr>
+          <w:rFonts w:ascii="Arial" w:cs="Arial" w:eastAsia="Arial" w:hAnsi="Arial"/>
+          <w:b/>
+          <w:bCs/>
+          <w:color w:val="1E293B"/>
+          <w:sz w:val="21"/>
+          <w:szCs w:val="21"/>
+        </w:rPr>
+        <w:t xml:space="preserve">Tidak ada iklan. Tidak ada penjualan data. Anggota KOMBAT dengan kemampuan terbatas tetap bisa mengakses semua fitur dasar tracking dan reminder secara gratis tanpa batas waktu.</w:t>
+      </w:r>
+    </w:p>
+    <w:p>
+      <w:r>
+        <w:br w:type="page"/>
+      </w:r>
+    </w:p>
+    <w:p>
+      <w:pPr>
+        <w:pStyle w:val="Heading1"/>
+        <w:spacing w:after="200" w:before="400"/>
+      </w:pPr>
+      <w:r>
+        <w:rPr>
+          <w:rFonts w:ascii="Arial" w:cs="Arial" w:eastAsia="Arial" w:hAnsi="Arial"/>
+          <w:b/>
+          <w:bCs/>
+          <w:color w:val="0F766E"/>
+          <w:sz w:val="32"/>
+          <w:szCs w:val="32"/>
+        </w:rPr>
+        <w:t xml:space="preserve">8. Proposal Kolaborasi</w:t>
+      </w:r>
+    </w:p>
+    <w:p>
+      <w:pPr>
+        <w:spacing w:after="120" w:line="276"/>
+      </w:pPr>
+      <w:r>
+        <w:rPr>
+          <w:rFonts w:ascii="Arial" w:cs="Arial" w:eastAsia="Arial" w:hAnsi="Arial"/>
+          <w:color w:val="1E293B"/>
+          <w:sz w:val="21"/>
+          <w:szCs w:val="21"/>
+        </w:rPr>
+        <w:t xml:space="preserve">Dengan ini, saya menawarkan JatuhTempo sebagai platform digital resmi untuk KOMBAT. Saya membangun ini sendiri, dengan kemampuan dan biaya saya sendiri, untuk mendukung program mulia yang sedang Bapak perjuangkan.</w:t>
+      </w:r>
+    </w:p>
+    <w:p>
+      <w:pPr>
+        <w:spacing w:after="60"/>
+      </w:pPr>
+    </w:p>
+    <w:p>
+      <w:pPr>
+        <w:pStyle w:val="Heading2"/>
+        <w:spacing w:after="150" w:before="300"/>
+      </w:pPr>
+      <w:r>
+        <w:rPr>
+          <w:rFonts w:ascii="Arial" w:cs="Arial" w:eastAsia="Arial" w:hAnsi="Arial"/>
+          <w:b/>
+          <w:bCs/>
+          <w:color w:val="1E293B"/>
+          <w:sz w:val="26"/>
+          <w:szCs w:val="26"/>
+        </w:rPr>
+        <w:t xml:space="preserve">Yang Saya Tawarkan</w:t>
+      </w:r>
+    </w:p>
+    <w:p>
+      <w:pPr>
+        <w:pStyle w:val="ListParagraph"/>
+        <w:numPr>
+          <w:ilvl w:val="0"/>
+          <w:numId w:val="2"/>
+        </w:numPr>
+        <w:spacing w:after="60" w:line="276"/>
+      </w:pPr>
+      <w:r>
+        <w:rPr>
+          <w:rFonts w:ascii="Arial" w:cs="Arial" w:eastAsia="Arial" w:hAnsi="Arial"/>
+          <w:color w:val="1E293B"/>
+          <w:sz w:val="21"/>
+          <w:szCs w:val="21"/>
+        </w:rPr>
+        <w:t xml:space="preserve">Akses penuh fitur dasar JatuhTempo untuk seluruh anggota KOMBAT secara gratis — tanpa biaya, tanpa iklan, tanpa batas waktu</w:t>
       </w:r>
     </w:p>
     <w:p>

</xml_diff>

<commit_message>
docs: honest proposal — separate current offerings from future potential
</commit_message>
<xml_diff>
--- a/JatuhTempo_KOMBAT_Proposal.docx
+++ b/JatuhTempo_KOMBAT_Proposal.docx
@@ -6130,7 +6130,7 @@
           <w:sz w:val="26"/>
           <w:szCs w:val="26"/>
         </w:rPr>
-        <w:t xml:space="preserve">Yang Saya Tawarkan</w:t>
+        <w:t xml:space="preserve">Yang Saat Ini Siap Saya Berikan</w:t>
       </w:r>
     </w:p>
     <w:p>
@@ -6168,7 +6168,7 @@
           <w:sz w:val="21"/>
           <w:szCs w:val="21"/>
         </w:rPr>
-        <w:t xml:space="preserve">Pengembangan fitur Opportunity Network khusus untuk ekosistem KOMBAT</w:t>
+        <w:t xml:space="preserve">Dashboard tracking utang yang bisa langsung dipakai anggota</w:t>
       </w:r>
     </w:p>
     <w:p>
@@ -6187,7 +6187,7 @@
           <w:sz w:val="21"/>
           <w:szCs w:val="21"/>
         </w:rPr>
-        <w:t xml:space="preserve">Integrasi dengan sesi mentoring dan konten edukasi KOMBAT</w:t>
+        <w:t xml:space="preserve">Reminder otomatis via Telegram untuk anggota KOMBAT</w:t>
       </w:r>
     </w:p>
     <w:p>
@@ -6206,7 +6206,43 @@
           <w:sz w:val="21"/>
           <w:szCs w:val="21"/>
         </w:rPr>
-        <w:t xml:space="preserve">Data agregat anonim untuk bahan konten edukasi</w:t>
+        <w:t xml:space="preserve">Bot Telegram @JatuhTempo_bot yang bisa langsung diakses</w:t>
+      </w:r>
+    </w:p>
+    <w:p>
+      <w:pPr>
+        <w:spacing w:after="60"/>
+      </w:pPr>
+    </w:p>
+    <w:p>
+      <w:pPr>
+        <w:pStyle w:val="Heading2"/>
+        <w:spacing w:after="150" w:before="300"/>
+      </w:pPr>
+      <w:r>
+        <w:rPr>
+          <w:rFonts w:ascii="Arial" w:cs="Arial" w:eastAsia="Arial" w:hAnsi="Arial"/>
+          <w:b/>
+          <w:bCs/>
+          <w:color w:val="1E293B"/>
+          <w:sz w:val="26"/>
+          <w:szCs w:val="26"/>
+        </w:rPr>
+        <w:t xml:space="preserve">Potensi Kolaborasi ke Depan</w:t>
+      </w:r>
+    </w:p>
+    <w:p>
+      <w:pPr>
+        <w:spacing w:after="120" w:line="276"/>
+      </w:pPr>
+      <w:r>
+        <w:rPr>
+          <w:rFonts w:ascii="Arial" w:cs="Arial" w:eastAsia="Arial" w:hAnsi="Arial"/>
+          <w:color w:val="1E293B"/>
+          <w:sz w:val="21"/>
+          <w:szCs w:val="21"/>
+        </w:rPr>
+        <w:t xml:space="preserve">Fitur-fitur berikut tidak ada di JatuhTempo saat ini, tapi bisa dikembangkan bersama berdasarkan kebutuhan KOMBAT:</w:t>
       </w:r>
     </w:p>
     <w:p>
@@ -6225,29 +6261,7 @@
           <w:sz w:val="21"/>
           <w:szCs w:val="21"/>
         </w:rPr>
-        <w:t xml:space="preserve">Dedikasi penuh: ini bukan side project, ini misi</w:t>
-      </w:r>
-    </w:p>
-    <w:p>
-      <w:pPr>
-        <w:spacing w:after="60"/>
-      </w:pPr>
-    </w:p>
-    <w:p>
-      <w:pPr>
-        <w:pStyle w:val="Heading2"/>
-        <w:spacing w:after="150" w:before="300"/>
-      </w:pPr>
-      <w:r>
-        <w:rPr>
-          <w:rFonts w:ascii="Arial" w:cs="Arial" w:eastAsia="Arial" w:hAnsi="Arial"/>
-          <w:b/>
-          <w:bCs/>
-          <w:color w:val="1E293B"/>
-          <w:sz w:val="26"/>
-          <w:szCs w:val="26"/>
-        </w:rPr>
-        <w:t xml:space="preserve">Yang Saya Butuhkan dari KOMBAT</w:t>
+        <w:t xml:space="preserve">Integrasi konten edukasi KOMBAT ke dalam dashboard atau bot</w:t>
       </w:r>
     </w:p>
     <w:p>
@@ -6266,7 +6280,7 @@
           <w:sz w:val="21"/>
           <w:szCs w:val="21"/>
         </w:rPr>
-        <w:t xml:space="preserve">Kesempatan untuk memperkenalkan JatuhTempo kepada anggota KOMBAT</w:t>
+        <w:t xml:space="preserve">Data agregat anonim untuk bahan konten edukasi (statistik utang anggota)</w:t>
       </w:r>
     </w:p>
     <w:p>
@@ -6285,7 +6299,7 @@
           <w:sz w:val="21"/>
           <w:szCs w:val="21"/>
         </w:rPr>
-        <w:t xml:space="preserve">Feedback dan masukan untuk prioritas fitur selanjutnya</w:t>
+        <w:t xml:space="preserve">Opportunity Network — connecting anggota dengan peluang penghasilan</w:t>
       </w:r>
     </w:p>
     <w:p>
@@ -6304,7 +6318,7 @@
           <w:sz w:val="21"/>
           <w:szCs w:val="21"/>
         </w:rPr>
-        <w:t xml:space="preserve">Akses untuk memahami kebutuhan anggota secara lebih dalam</w:t>
+        <w:t xml:space="preserve">Kustomisasi reminder dan konten sesuai sesi mentoring KOMBAT</w:t>
       </w:r>
     </w:p>
     <w:p>
@@ -6326,6 +6340,85 @@
           <w:sz w:val="26"/>
           <w:szCs w:val="26"/>
         </w:rPr>
+        <w:t xml:space="preserve">Yang Saya Butuhkan dari KOMBAT</w:t>
+      </w:r>
+    </w:p>
+    <w:p>
+      <w:pPr>
+        <w:pStyle w:val="ListParagraph"/>
+        <w:numPr>
+          <w:ilvl w:val="0"/>
+          <w:numId w:val="2"/>
+        </w:numPr>
+        <w:spacing w:after="60" w:line="276"/>
+      </w:pPr>
+      <w:r>
+        <w:rPr>
+          <w:rFonts w:ascii="Arial" w:cs="Arial" w:eastAsia="Arial" w:hAnsi="Arial"/>
+          <w:color w:val="1E293B"/>
+          <w:sz w:val="21"/>
+          <w:szCs w:val="21"/>
+        </w:rPr>
+        <w:t xml:space="preserve">Kesempatan untuk memperkenalkan JatuhTempo kepada anggota KOMBAT</w:t>
+      </w:r>
+    </w:p>
+    <w:p>
+      <w:pPr>
+        <w:pStyle w:val="ListParagraph"/>
+        <w:numPr>
+          <w:ilvl w:val="0"/>
+          <w:numId w:val="2"/>
+        </w:numPr>
+        <w:spacing w:after="60" w:line="276"/>
+      </w:pPr>
+      <w:r>
+        <w:rPr>
+          <w:rFonts w:ascii="Arial" w:cs="Arial" w:eastAsia="Arial" w:hAnsi="Arial"/>
+          <w:color w:val="1E293B"/>
+          <w:sz w:val="21"/>
+          <w:szCs w:val="21"/>
+        </w:rPr>
+        <w:t xml:space="preserve">Feedback dan masukan untuk prioritas fitur selanjutnya</w:t>
+      </w:r>
+    </w:p>
+    <w:p>
+      <w:pPr>
+        <w:pStyle w:val="ListParagraph"/>
+        <w:numPr>
+          <w:ilvl w:val="0"/>
+          <w:numId w:val="2"/>
+        </w:numPr>
+        <w:spacing w:after="60" w:line="276"/>
+      </w:pPr>
+      <w:r>
+        <w:rPr>
+          <w:rFonts w:ascii="Arial" w:cs="Arial" w:eastAsia="Arial" w:hAnsi="Arial"/>
+          <w:color w:val="1E293B"/>
+          <w:sz w:val="21"/>
+          <w:szCs w:val="21"/>
+        </w:rPr>
+        <w:t xml:space="preserve">Akses untuk memahami kebutuhan anggota secara lebih dalam</w:t>
+      </w:r>
+    </w:p>
+    <w:p>
+      <w:pPr>
+        <w:spacing w:after="60"/>
+      </w:pPr>
+    </w:p>
+    <w:p>
+      <w:pPr>
+        <w:pStyle w:val="Heading2"/>
+        <w:spacing w:after="150" w:before="300"/>
+      </w:pPr>
+      <w:r>
+        <w:rPr>
+          <w:rFonts w:ascii="Arial" w:cs="Arial" w:eastAsia="Arial" w:hAnsi="Arial"/>
+          <w:b/>
+          <w:bCs/>
+          <w:color w:val="1E293B"/>
+          <w:sz w:val="26"/>
+          <w:szCs w:val="26"/>
+        </w:rPr>
         <w:t xml:space="preserve">Next Steps</w:t>
       </w:r>
     </w:p>
@@ -6368,7 +6461,7 @@
           <w:sz w:val="21"/>
           <w:szCs w:val="21"/>
         </w:rPr>
-        <w:t xml:space="preserve">3. Integrasi Opportunity Network berdasarkan feedback anggota</w:t>
+        <w:t xml:space="preserve">3. Evaluasi bersama setelah 1 bulan penggunaan</w:t>
       </w:r>
     </w:p>
     <w:p>
@@ -6382,7 +6475,7 @@
           <w:sz w:val="21"/>
           <w:szCs w:val="21"/>
         </w:rPr>
-        <w:t xml:space="preserve">4. Evaluasi bersama setelah 1 bulan penggunaan</w:t>
+        <w:t xml:space="preserve">4. Prioritaskan fitur kolaborasi berdasarkan feedback anggota</w:t>
       </w:r>
     </w:p>
     <w:p>

</xml_diff>

<commit_message>
docs: add investment section — open for anchor investor
</commit_message>
<xml_diff>
--- a/JatuhTempo_KOMBAT_Proposal.docx
+++ b/JatuhTempo_KOMBAT_Proposal.docx
@@ -6398,6 +6398,132 @@
           <w:szCs w:val="21"/>
         </w:rPr>
         <w:t xml:space="preserve">Akses untuk memahami kebutuhan anggota secara lebih dalam</w:t>
+      </w:r>
+    </w:p>
+    <w:p>
+      <w:pPr>
+        <w:spacing w:after="60"/>
+      </w:pPr>
+    </w:p>
+    <w:p>
+      <w:pPr>
+        <w:pStyle w:val="Heading2"/>
+        <w:spacing w:after="150" w:before="300"/>
+      </w:pPr>
+      <w:r>
+        <w:rPr>
+          <w:rFonts w:ascii="Arial" w:cs="Arial" w:eastAsia="Arial" w:hAnsi="Arial"/>
+          <w:b/>
+          <w:bCs/>
+          <w:color w:val="1E293B"/>
+          <w:sz w:val="26"/>
+          <w:szCs w:val="26"/>
+        </w:rPr>
+        <w:t xml:space="preserve">Open for Investment</w:t>
+      </w:r>
+    </w:p>
+    <w:p>
+      <w:pPr>
+        <w:spacing w:after="120" w:line="276"/>
+      </w:pPr>
+      <w:r>
+        <w:rPr>
+          <w:rFonts w:ascii="Arial" w:cs="Arial" w:eastAsia="Arial" w:hAnsi="Arial"/>
+          <w:color w:val="1E293B"/>
+          <w:sz w:val="21"/>
+          <w:szCs w:val="21"/>
+        </w:rPr>
+        <w:t xml:space="preserve">Saat ini JatuhTempo didanai sepenuhnya dari kantong pribadi — biaya server, domain, API DeepSeek, semuanya. Untuk mempercepat pengembangan fitur Opportunity Network, WhatsApp Bot, dan jangkauan yang lebih luas, saya terbuka untuk anchor investment dari Bapak atau pihak yang Bapak percaya.</w:t>
+      </w:r>
+    </w:p>
+    <w:p>
+      <w:pPr>
+        <w:spacing w:after="120" w:line="276"/>
+      </w:pPr>
+      <w:r>
+        <w:rPr>
+          <w:rFonts w:ascii="Arial" w:cs="Arial" w:eastAsia="Arial" w:hAnsi="Arial"/>
+          <w:color w:val="1E293B"/>
+          <w:sz w:val="21"/>
+          <w:szCs w:val="21"/>
+        </w:rPr>
+        <w:t xml:space="preserve">Bentuknya bisa berupa:</w:t>
+      </w:r>
+    </w:p>
+    <w:p>
+      <w:pPr>
+        <w:pStyle w:val="ListParagraph"/>
+        <w:numPr>
+          <w:ilvl w:val="0"/>
+          <w:numId w:val="2"/>
+        </w:numPr>
+        <w:spacing w:after="60" w:line="276"/>
+      </w:pPr>
+      <w:r>
+        <w:rPr>
+          <w:rFonts w:ascii="Arial" w:cs="Arial" w:eastAsia="Arial" w:hAnsi="Arial"/>
+          <w:color w:val="1E293B"/>
+          <w:sz w:val="21"/>
+          <w:szCs w:val="21"/>
+        </w:rPr>
+        <w:t xml:space="preserve">Investasi langsung (sebagai angel/anchor investor)</w:t>
+      </w:r>
+    </w:p>
+    <w:p>
+      <w:pPr>
+        <w:pStyle w:val="ListParagraph"/>
+        <w:numPr>
+          <w:ilvl w:val="0"/>
+          <w:numId w:val="2"/>
+        </w:numPr>
+        <w:spacing w:after="60" w:line="276"/>
+      </w:pPr>
+      <w:r>
+        <w:rPr>
+          <w:rFonts w:ascii="Arial" w:cs="Arial" w:eastAsia="Arial" w:hAnsi="Arial"/>
+          <w:color w:val="1E293B"/>
+          <w:sz w:val="21"/>
+          <w:szCs w:val="21"/>
+        </w:rPr>
+        <w:t xml:space="preserve">Sponsorship pengembangan fitur spesifik (misal: Opportunity Network)</w:t>
+      </w:r>
+    </w:p>
+    <w:p>
+      <w:pPr>
+        <w:pStyle w:val="ListParagraph"/>
+        <w:numPr>
+          <w:ilvl w:val="0"/>
+          <w:numId w:val="2"/>
+        </w:numPr>
+        <w:spacing w:after="60" w:line="276"/>
+      </w:pPr>
+      <w:r>
+        <w:rPr>
+          <w:rFonts w:ascii="Arial" w:cs="Arial" w:eastAsia="Arial" w:hAnsi="Arial"/>
+          <w:color w:val="1E293B"/>
+          <w:sz w:val="21"/>
+          <w:szCs w:val="21"/>
+        </w:rPr>
+        <w:t xml:space="preserve">Revenue sharing dari fitur yang dimonetisasi nantinya</w:t>
+      </w:r>
+    </w:p>
+    <w:p>
+      <w:pPr>
+        <w:spacing w:after="60"/>
+      </w:pPr>
+    </w:p>
+    <w:p>
+      <w:pPr>
+        <w:spacing w:after="120" w:line="276"/>
+      </w:pPr>
+      <w:r>
+        <w:rPr>
+          <w:rFonts w:ascii="Arial" w:cs="Arial" w:eastAsia="Arial" w:hAnsi="Arial"/>
+          <w:color w:val="1E293B"/>
+          <w:sz w:val="21"/>
+          <w:szCs w:val="21"/>
+        </w:rPr>
+        <w:t xml:space="preserve">Yang pasti: JatuhTempo tidak akan pernah meminta uang dari anggota KOMBAT. Model bisnis dirancang agar yang membayar adalah pihak yang mampu (pemberi peluang, power user Pro), bukan mereka yang sedang berjuang keluar dari utang.</w:t>
       </w:r>
     </w:p>
     <w:p>

</xml_diff>

<commit_message>
docs: add donation option at top of investment section
</commit_message>
<xml_diff>
--- a/JatuhTempo_KOMBAT_Proposal.docx
+++ b/JatuhTempo_KOMBAT_Proposal.docx
@@ -6433,21 +6433,26 @@
           <w:sz w:val="21"/>
           <w:szCs w:val="21"/>
         </w:rPr>
-        <w:t xml:space="preserve">Saat ini JatuhTempo didanai sepenuhnya dari kantong pribadi — biaya server, domain, API DeepSeek, semuanya. Untuk mempercepat pengembangan fitur Opportunity Network, WhatsApp Bot, dan jangkauan yang lebih luas, saya terbuka untuk anchor investment dari Bapak atau pihak yang Bapak percaya.</w:t>
-      </w:r>
-    </w:p>
-    <w:p>
-      <w:pPr>
-        <w:spacing w:after="120" w:line="276"/>
-      </w:pPr>
-      <w:r>
-        <w:rPr>
-          <w:rFonts w:ascii="Arial" w:cs="Arial" w:eastAsia="Arial" w:hAnsi="Arial"/>
-          <w:color w:val="1E293B"/>
-          <w:sz w:val="21"/>
-          <w:szCs w:val="21"/>
-        </w:rPr>
-        <w:t xml:space="preserve">Bentuknya bisa berupa:</w:t>
+        <w:t xml:space="preserve">Saat ini JatuhTempo didanai sepenuhnya dari kantong pribadi — biaya server, domain, API DeepSeek, semuanya. Untuk mempercepat pengembangan fitur Opportunity Network, WhatsApp Bot, dan jangkauan yang lebih luas, saya terbuka untuk:</w:t>
+      </w:r>
+    </w:p>
+    <w:p>
+      <w:pPr>
+        <w:pStyle w:val="ListParagraph"/>
+        <w:numPr>
+          <w:ilvl w:val="0"/>
+          <w:numId w:val="2"/>
+        </w:numPr>
+        <w:spacing w:after="60" w:line="276"/>
+      </w:pPr>
+      <w:r>
+        <w:rPr>
+          <w:rFonts w:ascii="Arial" w:cs="Arial" w:eastAsia="Arial" w:hAnsi="Arial"/>
+          <w:color w:val="1E293B"/>
+          <w:sz w:val="21"/>
+          <w:szCs w:val="21"/>
+        </w:rPr>
+        <w:t xml:space="preserve">Donasi: bentuk dukungan paling sederhana, untuk bantu biaya operasional server dan API</w:t>
       </w:r>
     </w:p>
     <w:p>

</xml_diff>

<commit_message>
docs: add debt collector vs JatuhTempo comparison table
</commit_message>
<xml_diff>
--- a/JatuhTempo_KOMBAT_Proposal.docx
+++ b/JatuhTempo_KOMBAT_Proposal.docx
@@ -327,7 +327,781 @@
           <w:sz w:val="21"/>
           <w:szCs w:val="21"/>
         </w:rPr>
-        <w:t xml:space="preserve">Berdasarkan data OJK (2025), outstanding pinjaman fintech lending di Indonesia mencapai Rp78,2 triliun dengan lebih dari 19 juta akun peminjam. Sementara itu, utang paylater tercatat Rp66 triliun pada 2024 dan terus bertumbuh setiap tahun.</w:t>
+        <w:t xml:space="preserve">Berdasarkan data OJK (2025), outstanding pinjaman fintech lending di Indonesia mencapai Rp78,2 triliun dengan lebih dari 19 juta akun peminjam. Sementara itu, utang paylater tercatat Rp66 triliun pada 2024 dan terus bertumbuh setiap tahun. Banyak dari mereka yang akhirnya diteror debt collector melalui telepon, SMS, dan WhatsApp — tekanan yang datang SETELAH jatuh tempo, ketika sudah terlambat.</w:t>
+      </w:r>
+    </w:p>
+    <w:p>
+      <w:pPr>
+        <w:spacing w:after="60"/>
+      </w:pPr>
+    </w:p>
+    <w:p>
+      <w:pPr>
+        <w:pStyle w:val="Heading2"/>
+        <w:spacing w:after="150" w:before="300"/>
+      </w:pPr>
+      <w:r>
+        <w:rPr>
+          <w:rFonts w:ascii="Arial" w:cs="Arial" w:eastAsia="Arial" w:hAnsi="Arial"/>
+          <w:b/>
+          <w:bCs/>
+          <w:color w:val="1E293B"/>
+          <w:sz w:val="26"/>
+          <w:szCs w:val="26"/>
+        </w:rPr>
+        <w:t xml:space="preserve">2.2 JatuhTempo vs Debt Collector</w:t>
+      </w:r>
+    </w:p>
+    <w:tbl>
+      <w:tblPr>
+        <w:tblW w:type="dxa" w:w="9360"/>
+        <w:tblBorders>
+          <w:top w:val="single" w:color="auto" w:sz="4"/>
+          <w:left w:val="single" w:color="auto" w:sz="4"/>
+          <w:bottom w:val="single" w:color="auto" w:sz="4"/>
+          <w:right w:val="single" w:color="auto" w:sz="4"/>
+          <w:insideH w:val="single" w:color="auto" w:sz="4"/>
+          <w:insideV w:val="single" w:color="auto" w:sz="4"/>
+        </w:tblBorders>
+      </w:tblPr>
+      <w:tblGrid>
+        <w:gridCol w:w="3120"/>
+        <w:gridCol w:w="3120"/>
+        <w:gridCol w:w="3120"/>
+      </w:tblGrid>
+      <w:tr>
+        <w:tc>
+          <w:tcPr>
+            <w:tcW w:type="dxa" w:w="3120"/>
+            <w:tcBorders>
+              <w:top w:val="single" w:color="E2E8F0" w:sz="1"/>
+              <w:left w:val="single" w:color="E2E8F0" w:sz="1"/>
+              <w:bottom w:val="single" w:color="E2E8F0" w:sz="1"/>
+              <w:right w:val="single" w:color="E2E8F0" w:sz="1"/>
+            </w:tcBorders>
+            <w:shd w:fill="0D9488" w:val="clear"/>
+            <w:tcMar>
+              <w:top w:type="dxa" w:w="60"/>
+              <w:left w:type="dxa" w:w="100"/>
+              <w:bottom w:type="dxa" w:w="60"/>
+              <w:right w:type="dxa" w:w="100"/>
+            </w:tcMar>
+            <w:vAlign w:val="center"/>
+          </w:tcPr>
+          <w:p>
+            <w:pPr>
+              <w:spacing w:after="120" w:line="276"/>
+            </w:pPr>
+            <w:r>
+              <w:rPr>
+                <w:rFonts w:ascii="Arial" w:cs="Arial" w:eastAsia="Arial" w:hAnsi="Arial"/>
+                <w:b/>
+                <w:bCs/>
+                <w:color w:val="1E293B"/>
+                <w:sz w:val="21"/>
+                <w:szCs w:val="21"/>
+              </w:rPr>
+              <w:t xml:space="preserve"/>
+            </w:r>
+          </w:p>
+        </w:tc>
+        <w:tc>
+          <w:tcPr>
+            <w:tcW w:type="dxa" w:w="3120"/>
+            <w:tcBorders>
+              <w:top w:val="single" w:color="E2E8F0" w:sz="1"/>
+              <w:left w:val="single" w:color="E2E8F0" w:sz="1"/>
+              <w:bottom w:val="single" w:color="E2E8F0" w:sz="1"/>
+              <w:right w:val="single" w:color="E2E8F0" w:sz="1"/>
+            </w:tcBorders>
+            <w:shd w:fill="DC2626" w:val="clear"/>
+            <w:tcMar>
+              <w:top w:type="dxa" w:w="60"/>
+              <w:left w:type="dxa" w:w="100"/>
+              <w:bottom w:type="dxa" w:w="60"/>
+              <w:right w:type="dxa" w:w="100"/>
+            </w:tcMar>
+            <w:vAlign w:val="center"/>
+          </w:tcPr>
+          <w:p>
+            <w:pPr>
+              <w:spacing w:after="120" w:line="276"/>
+            </w:pPr>
+            <w:r>
+              <w:rPr>
+                <w:rFonts w:ascii="Arial" w:cs="Arial" w:eastAsia="Arial" w:hAnsi="Arial"/>
+                <w:b/>
+                <w:bCs/>
+                <w:color w:val="FFFFFF"/>
+                <w:sz w:val="21"/>
+                <w:szCs w:val="21"/>
+              </w:rPr>
+              <w:t xml:space="preserve">Debt Collector</w:t>
+            </w:r>
+          </w:p>
+        </w:tc>
+        <w:tc>
+          <w:tcPr>
+            <w:tcW w:type="dxa" w:w="3120"/>
+            <w:tcBorders>
+              <w:top w:val="single" w:color="E2E8F0" w:sz="1"/>
+              <w:left w:val="single" w:color="E2E8F0" w:sz="1"/>
+              <w:bottom w:val="single" w:color="E2E8F0" w:sz="1"/>
+              <w:right w:val="single" w:color="E2E8F0" w:sz="1"/>
+            </w:tcBorders>
+            <w:shd w:fill="0D9488" w:val="clear"/>
+            <w:tcMar>
+              <w:top w:type="dxa" w:w="60"/>
+              <w:left w:type="dxa" w:w="100"/>
+              <w:bottom w:type="dxa" w:w="60"/>
+              <w:right w:type="dxa" w:w="100"/>
+            </w:tcMar>
+            <w:vAlign w:val="center"/>
+          </w:tcPr>
+          <w:p>
+            <w:pPr>
+              <w:spacing w:after="120" w:line="276"/>
+            </w:pPr>
+            <w:r>
+              <w:rPr>
+                <w:rFonts w:ascii="Arial" w:cs="Arial" w:eastAsia="Arial" w:hAnsi="Arial"/>
+                <w:b/>
+                <w:bCs/>
+                <w:color w:val="FFFFFF"/>
+                <w:sz w:val="21"/>
+                <w:szCs w:val="21"/>
+              </w:rPr>
+              <w:t xml:space="preserve">JatuhTempo</w:t>
+            </w:r>
+          </w:p>
+        </w:tc>
+      </w:tr>
+      <w:tr>
+        <w:tc>
+          <w:tcPr>
+            <w:tcW w:type="dxa" w:w="3120"/>
+            <w:tcBorders>
+              <w:top w:val="single" w:color="E2E8F0" w:sz="1"/>
+              <w:left w:val="single" w:color="E2E8F0" w:sz="1"/>
+              <w:bottom w:val="single" w:color="E2E8F0" w:sz="1"/>
+              <w:right w:val="single" w:color="E2E8F0" w:sz="1"/>
+            </w:tcBorders>
+            <w:shd w:fill="F0FDFA" w:val="clear"/>
+            <w:tcMar>
+              <w:top w:type="dxa" w:w="60"/>
+              <w:left w:type="dxa" w:w="100"/>
+              <w:bottom w:type="dxa" w:w="60"/>
+              <w:right w:type="dxa" w:w="100"/>
+            </w:tcMar>
+            <w:vAlign w:val="center"/>
+          </w:tcPr>
+          <w:p>
+            <w:pPr>
+              <w:spacing w:after="120" w:line="276"/>
+            </w:pPr>
+            <w:r>
+              <w:rPr>
+                <w:rFonts w:ascii="Arial" w:cs="Arial" w:eastAsia="Arial" w:hAnsi="Arial"/>
+                <w:b/>
+                <w:bCs/>
+                <w:color w:val="1E293B"/>
+                <w:sz w:val="21"/>
+                <w:szCs w:val="21"/>
+              </w:rPr>
+              <w:t xml:space="preserve">Waktu</w:t>
+            </w:r>
+          </w:p>
+        </w:tc>
+        <w:tc>
+          <w:tcPr>
+            <w:tcW w:type="dxa" w:w="3120"/>
+            <w:tcBorders>
+              <w:top w:val="single" w:color="E2E8F0" w:sz="1"/>
+              <w:left w:val="single" w:color="E2E8F0" w:sz="1"/>
+              <w:bottom w:val="single" w:color="E2E8F0" w:sz="1"/>
+              <w:right w:val="single" w:color="E2E8F0" w:sz="1"/>
+            </w:tcBorders>
+            <w:tcMar>
+              <w:top w:type="dxa" w:w="60"/>
+              <w:left w:type="dxa" w:w="100"/>
+              <w:bottom w:type="dxa" w:w="60"/>
+              <w:right w:type="dxa" w:w="100"/>
+            </w:tcMar>
+            <w:vAlign w:val="center"/>
+          </w:tcPr>
+          <w:p>
+            <w:pPr>
+              <w:spacing w:after="120" w:line="276"/>
+            </w:pPr>
+            <w:r>
+              <w:rPr>
+                <w:rFonts w:ascii="Arial" w:cs="Arial" w:eastAsia="Arial" w:hAnsi="Arial"/>
+                <w:color w:val="1E293B"/>
+                <w:sz w:val="21"/>
+                <w:szCs w:val="21"/>
+              </w:rPr>
+              <w:t xml:space="preserve">SETELAH jatuh tempo</w:t>
+            </w:r>
+          </w:p>
+        </w:tc>
+        <w:tc>
+          <w:tcPr>
+            <w:tcW w:type="dxa" w:w="3120"/>
+            <w:tcBorders>
+              <w:top w:val="single" w:color="E2E8F0" w:sz="1"/>
+              <w:left w:val="single" w:color="E2E8F0" w:sz="1"/>
+              <w:bottom w:val="single" w:color="E2E8F0" w:sz="1"/>
+              <w:right w:val="single" w:color="E2E8F0" w:sz="1"/>
+            </w:tcBorders>
+            <w:tcMar>
+              <w:top w:type="dxa" w:w="60"/>
+              <w:left w:type="dxa" w:w="100"/>
+              <w:bottom w:type="dxa" w:w="60"/>
+              <w:right w:type="dxa" w:w="100"/>
+            </w:tcMar>
+            <w:vAlign w:val="center"/>
+          </w:tcPr>
+          <w:p>
+            <w:pPr>
+              <w:spacing w:after="120" w:line="276"/>
+            </w:pPr>
+            <w:r>
+              <w:rPr>
+                <w:rFonts w:ascii="Arial" w:cs="Arial" w:eastAsia="Arial" w:hAnsi="Arial"/>
+                <w:color w:val="1E293B"/>
+                <w:sz w:val="21"/>
+                <w:szCs w:val="21"/>
+              </w:rPr>
+              <w:t xml:space="preserve">SEBELUM jatuh tempo</w:t>
+            </w:r>
+          </w:p>
+        </w:tc>
+      </w:tr>
+      <w:tr>
+        <w:tc>
+          <w:tcPr>
+            <w:tcW w:type="dxa" w:w="3120"/>
+            <w:tcBorders>
+              <w:top w:val="single" w:color="E2E8F0" w:sz="1"/>
+              <w:left w:val="single" w:color="E2E8F0" w:sz="1"/>
+              <w:bottom w:val="single" w:color="E2E8F0" w:sz="1"/>
+              <w:right w:val="single" w:color="E2E8F0" w:sz="1"/>
+            </w:tcBorders>
+            <w:shd w:fill="F0FDFA" w:val="clear"/>
+            <w:tcMar>
+              <w:top w:type="dxa" w:w="60"/>
+              <w:left w:type="dxa" w:w="100"/>
+              <w:bottom w:type="dxa" w:w="60"/>
+              <w:right w:type="dxa" w:w="100"/>
+            </w:tcMar>
+            <w:vAlign w:val="center"/>
+          </w:tcPr>
+          <w:p>
+            <w:pPr>
+              <w:spacing w:after="120" w:line="276"/>
+            </w:pPr>
+            <w:r>
+              <w:rPr>
+                <w:rFonts w:ascii="Arial" w:cs="Arial" w:eastAsia="Arial" w:hAnsi="Arial"/>
+                <w:b/>
+                <w:bCs/>
+                <w:color w:val="1E293B"/>
+                <w:sz w:val="21"/>
+                <w:szCs w:val="21"/>
+              </w:rPr>
+              <w:t xml:space="preserve">Frekuensi</w:t>
+            </w:r>
+          </w:p>
+        </w:tc>
+        <w:tc>
+          <w:tcPr>
+            <w:tcW w:type="dxa" w:w="3120"/>
+            <w:tcBorders>
+              <w:top w:val="single" w:color="E2E8F0" w:sz="1"/>
+              <w:left w:val="single" w:color="E2E8F0" w:sz="1"/>
+              <w:bottom w:val="single" w:color="E2E8F0" w:sz="1"/>
+              <w:right w:val="single" w:color="E2E8F0" w:sz="1"/>
+            </w:tcBorders>
+            <w:tcMar>
+              <w:top w:type="dxa" w:w="60"/>
+              <w:left w:type="dxa" w:w="100"/>
+              <w:bottom w:type="dxa" w:w="60"/>
+              <w:right w:type="dxa" w:w="100"/>
+            </w:tcMar>
+            <w:vAlign w:val="center"/>
+          </w:tcPr>
+          <w:p>
+            <w:pPr>
+              <w:spacing w:after="120" w:line="276"/>
+            </w:pPr>
+            <w:r>
+              <w:rPr>
+                <w:rFonts w:ascii="Arial" w:cs="Arial" w:eastAsia="Arial" w:hAnsi="Arial"/>
+                <w:color w:val="1E293B"/>
+                <w:sz w:val="21"/>
+                <w:szCs w:val="21"/>
+              </w:rPr>
+              <w:t xml:space="preserve">10+ kali sehari, random</w:t>
+            </w:r>
+          </w:p>
+        </w:tc>
+        <w:tc>
+          <w:tcPr>
+            <w:tcW w:type="dxa" w:w="3120"/>
+            <w:tcBorders>
+              <w:top w:val="single" w:color="E2E8F0" w:sz="1"/>
+              <w:left w:val="single" w:color="E2E8F0" w:sz="1"/>
+              <w:bottom w:val="single" w:color="E2E8F0" w:sz="1"/>
+              <w:right w:val="single" w:color="E2E8F0" w:sz="1"/>
+            </w:tcBorders>
+            <w:tcMar>
+              <w:top w:type="dxa" w:w="60"/>
+              <w:left w:type="dxa" w:w="100"/>
+              <w:bottom w:type="dxa" w:w="60"/>
+              <w:right w:type="dxa" w:w="100"/>
+            </w:tcMar>
+            <w:vAlign w:val="center"/>
+          </w:tcPr>
+          <w:p>
+            <w:pPr>
+              <w:spacing w:after="120" w:line="276"/>
+            </w:pPr>
+            <w:r>
+              <w:rPr>
+                <w:rFonts w:ascii="Arial" w:cs="Arial" w:eastAsia="Arial" w:hAnsi="Arial"/>
+                <w:color w:val="1E293B"/>
+                <w:sz w:val="21"/>
+                <w:szCs w:val="21"/>
+              </w:rPr>
+              <w:t xml:space="preserve">5 pesan total, terjadwal</w:t>
+            </w:r>
+          </w:p>
+        </w:tc>
+      </w:tr>
+      <w:tr>
+        <w:tc>
+          <w:tcPr>
+            <w:tcW w:type="dxa" w:w="3120"/>
+            <w:tcBorders>
+              <w:top w:val="single" w:color="E2E8F0" w:sz="1"/>
+              <w:left w:val="single" w:color="E2E8F0" w:sz="1"/>
+              <w:bottom w:val="single" w:color="E2E8F0" w:sz="1"/>
+              <w:right w:val="single" w:color="E2E8F0" w:sz="1"/>
+            </w:tcBorders>
+            <w:shd w:fill="F0FDFA" w:val="clear"/>
+            <w:tcMar>
+              <w:top w:type="dxa" w:w="60"/>
+              <w:left w:type="dxa" w:w="100"/>
+              <w:bottom w:type="dxa" w:w="60"/>
+              <w:right w:type="dxa" w:w="100"/>
+            </w:tcMar>
+            <w:vAlign w:val="center"/>
+          </w:tcPr>
+          <w:p>
+            <w:pPr>
+              <w:spacing w:after="120" w:line="276"/>
+            </w:pPr>
+            <w:r>
+              <w:rPr>
+                <w:rFonts w:ascii="Arial" w:cs="Arial" w:eastAsia="Arial" w:hAnsi="Arial"/>
+                <w:b/>
+                <w:bCs/>
+                <w:color w:val="1E293B"/>
+                <w:sz w:val="21"/>
+                <w:szCs w:val="21"/>
+              </w:rPr>
+              <w:t xml:space="preserve">Nada</w:t>
+            </w:r>
+          </w:p>
+        </w:tc>
+        <w:tc>
+          <w:tcPr>
+            <w:tcW w:type="dxa" w:w="3120"/>
+            <w:tcBorders>
+              <w:top w:val="single" w:color="E2E8F0" w:sz="1"/>
+              <w:left w:val="single" w:color="E2E8F0" w:sz="1"/>
+              <w:bottom w:val="single" w:color="E2E8F0" w:sz="1"/>
+              <w:right w:val="single" w:color="E2E8F0" w:sz="1"/>
+            </w:tcBorders>
+            <w:tcMar>
+              <w:top w:type="dxa" w:w="60"/>
+              <w:left w:type="dxa" w:w="100"/>
+              <w:bottom w:type="dxa" w:w="60"/>
+              <w:right w:type="dxa" w:w="100"/>
+            </w:tcMar>
+            <w:vAlign w:val="center"/>
+          </w:tcPr>
+          <w:p>
+            <w:pPr>
+              <w:spacing w:after="120" w:line="276"/>
+            </w:pPr>
+            <w:r>
+              <w:rPr>
+                <w:rFonts w:ascii="Arial" w:cs="Arial" w:eastAsia="Arial" w:hAnsi="Arial"/>
+                <w:color w:val="1E293B"/>
+                <w:sz w:val="21"/>
+                <w:szCs w:val="21"/>
+              </w:rPr>
+              <w:t xml:space="preserve">Ancaman, tekanan, teror</w:t>
+            </w:r>
+          </w:p>
+        </w:tc>
+        <w:tc>
+          <w:tcPr>
+            <w:tcW w:type="dxa" w:w="3120"/>
+            <w:tcBorders>
+              <w:top w:val="single" w:color="E2E8F0" w:sz="1"/>
+              <w:left w:val="single" w:color="E2E8F0" w:sz="1"/>
+              <w:bottom w:val="single" w:color="E2E8F0" w:sz="1"/>
+              <w:right w:val="single" w:color="E2E8F0" w:sz="1"/>
+            </w:tcBorders>
+            <w:tcMar>
+              <w:top w:type="dxa" w:w="60"/>
+              <w:left w:type="dxa" w:w="100"/>
+              <w:bottom w:type="dxa" w:w="60"/>
+              <w:right w:type="dxa" w:w="100"/>
+            </w:tcMar>
+            <w:vAlign w:val="center"/>
+          </w:tcPr>
+          <w:p>
+            <w:pPr>
+              <w:spacing w:after="120" w:line="276"/>
+            </w:pPr>
+            <w:r>
+              <w:rPr>
+                <w:rFonts w:ascii="Arial" w:cs="Arial" w:eastAsia="Arial" w:hAnsi="Arial"/>
+                <w:color w:val="1E293B"/>
+                <w:sz w:val="21"/>
+                <w:szCs w:val="21"/>
+              </w:rPr>
+              <w:t xml:space="preserve">Informatif, mendukung</w:t>
+            </w:r>
+          </w:p>
+        </w:tc>
+      </w:tr>
+      <w:tr>
+        <w:tc>
+          <w:tcPr>
+            <w:tcW w:type="dxa" w:w="3120"/>
+            <w:tcBorders>
+              <w:top w:val="single" w:color="E2E8F0" w:sz="1"/>
+              <w:left w:val="single" w:color="E2E8F0" w:sz="1"/>
+              <w:bottom w:val="single" w:color="E2E8F0" w:sz="1"/>
+              <w:right w:val="single" w:color="E2E8F0" w:sz="1"/>
+            </w:tcBorders>
+            <w:shd w:fill="F0FDFA" w:val="clear"/>
+            <w:tcMar>
+              <w:top w:type="dxa" w:w="60"/>
+              <w:left w:type="dxa" w:w="100"/>
+              <w:bottom w:type="dxa" w:w="60"/>
+              <w:right w:type="dxa" w:w="100"/>
+            </w:tcMar>
+            <w:vAlign w:val="center"/>
+          </w:tcPr>
+          <w:p>
+            <w:pPr>
+              <w:spacing w:after="120" w:line="276"/>
+            </w:pPr>
+            <w:r>
+              <w:rPr>
+                <w:rFonts w:ascii="Arial" w:cs="Arial" w:eastAsia="Arial" w:hAnsi="Arial"/>
+                <w:b/>
+                <w:bCs/>
+                <w:color w:val="1E293B"/>
+                <w:sz w:val="21"/>
+                <w:szCs w:val="21"/>
+              </w:rPr>
+              <w:t xml:space="preserve">Kontrol</w:t>
+            </w:r>
+          </w:p>
+        </w:tc>
+        <w:tc>
+          <w:tcPr>
+            <w:tcW w:type="dxa" w:w="3120"/>
+            <w:tcBorders>
+              <w:top w:val="single" w:color="E2E8F0" w:sz="1"/>
+              <w:left w:val="single" w:color="E2E8F0" w:sz="1"/>
+              <w:bottom w:val="single" w:color="E2E8F0" w:sz="1"/>
+              <w:right w:val="single" w:color="E2E8F0" w:sz="1"/>
+            </w:tcBorders>
+            <w:tcMar>
+              <w:top w:type="dxa" w:w="60"/>
+              <w:left w:type="dxa" w:w="100"/>
+              <w:bottom w:type="dxa" w:w="60"/>
+              <w:right w:type="dxa" w:w="100"/>
+            </w:tcMar>
+            <w:vAlign w:val="center"/>
+          </w:tcPr>
+          <w:p>
+            <w:pPr>
+              <w:spacing w:after="120" w:line="276"/>
+            </w:pPr>
+            <w:r>
+              <w:rPr>
+                <w:rFonts w:ascii="Arial" w:cs="Arial" w:eastAsia="Arial" w:hAnsi="Arial"/>
+                <w:color w:val="1E293B"/>
+                <w:sz w:val="21"/>
+                <w:szCs w:val="21"/>
+              </w:rPr>
+              <w:t xml:space="preserve">User tidak bisa berhenti</w:t>
+            </w:r>
+          </w:p>
+        </w:tc>
+        <w:tc>
+          <w:tcPr>
+            <w:tcW w:type="dxa" w:w="3120"/>
+            <w:tcBorders>
+              <w:top w:val="single" w:color="E2E8F0" w:sz="1"/>
+              <w:left w:val="single" w:color="E2E8F0" w:sz="1"/>
+              <w:bottom w:val="single" w:color="E2E8F0" w:sz="1"/>
+              <w:right w:val="single" w:color="E2E8F0" w:sz="1"/>
+            </w:tcBorders>
+            <w:tcMar>
+              <w:top w:type="dxa" w:w="60"/>
+              <w:left w:type="dxa" w:w="100"/>
+              <w:bottom w:type="dxa" w:w="60"/>
+              <w:right w:type="dxa" w:w="100"/>
+            </w:tcMar>
+            <w:vAlign w:val="center"/>
+          </w:tcPr>
+          <w:p>
+            <w:pPr>
+              <w:spacing w:after="120" w:line="276"/>
+            </w:pPr>
+            <w:r>
+              <w:rPr>
+                <w:rFonts w:ascii="Arial" w:cs="Arial" w:eastAsia="Arial" w:hAnsi="Arial"/>
+                <w:color w:val="1E293B"/>
+                <w:sz w:val="21"/>
+                <w:szCs w:val="21"/>
+              </w:rPr>
+              <w:t xml:space="preserve">Mark paid / delete kapan saja</w:t>
+            </w:r>
+          </w:p>
+        </w:tc>
+      </w:tr>
+      <w:tr>
+        <w:tc>
+          <w:tcPr>
+            <w:tcW w:type="dxa" w:w="3120"/>
+            <w:tcBorders>
+              <w:top w:val="single" w:color="E2E8F0" w:sz="1"/>
+              <w:left w:val="single" w:color="E2E8F0" w:sz="1"/>
+              <w:bottom w:val="single" w:color="E2E8F0" w:sz="1"/>
+              <w:right w:val="single" w:color="E2E8F0" w:sz="1"/>
+            </w:tcBorders>
+            <w:shd w:fill="F0FDFA" w:val="clear"/>
+            <w:tcMar>
+              <w:top w:type="dxa" w:w="60"/>
+              <w:left w:type="dxa" w:w="100"/>
+              <w:bottom w:type="dxa" w:w="60"/>
+              <w:right w:type="dxa" w:w="100"/>
+            </w:tcMar>
+            <w:vAlign w:val="center"/>
+          </w:tcPr>
+          <w:p>
+            <w:pPr>
+              <w:spacing w:after="120" w:line="276"/>
+            </w:pPr>
+            <w:r>
+              <w:rPr>
+                <w:rFonts w:ascii="Arial" w:cs="Arial" w:eastAsia="Arial" w:hAnsi="Arial"/>
+                <w:b/>
+                <w:bCs/>
+                <w:color w:val="1E293B"/>
+                <w:sz w:val="21"/>
+                <w:szCs w:val="21"/>
+              </w:rPr>
+              <w:t xml:space="preserve">Tujuan</w:t>
+            </w:r>
+          </w:p>
+        </w:tc>
+        <w:tc>
+          <w:tcPr>
+            <w:tcW w:type="dxa" w:w="3120"/>
+            <w:tcBorders>
+              <w:top w:val="single" w:color="E2E8F0" w:sz="1"/>
+              <w:left w:val="single" w:color="E2E8F0" w:sz="1"/>
+              <w:bottom w:val="single" w:color="E2E8F0" w:sz="1"/>
+              <w:right w:val="single" w:color="E2E8F0" w:sz="1"/>
+            </w:tcBorders>
+            <w:tcMar>
+              <w:top w:type="dxa" w:w="60"/>
+              <w:left w:type="dxa" w:w="100"/>
+              <w:bottom w:type="dxa" w:w="60"/>
+              <w:right w:type="dxa" w:w="100"/>
+            </w:tcMar>
+            <w:vAlign w:val="center"/>
+          </w:tcPr>
+          <w:p>
+            <w:pPr>
+              <w:spacing w:after="120" w:line="276"/>
+            </w:pPr>
+            <w:r>
+              <w:rPr>
+                <w:rFonts w:ascii="Arial" w:cs="Arial" w:eastAsia="Arial" w:hAnsi="Arial"/>
+                <w:color w:val="1E293B"/>
+                <w:sz w:val="21"/>
+                <w:szCs w:val="21"/>
+              </w:rPr>
+              <w:t xml:space="preserve">Tagih uang</w:t>
+            </w:r>
+          </w:p>
+        </w:tc>
+        <w:tc>
+          <w:tcPr>
+            <w:tcW w:type="dxa" w:w="3120"/>
+            <w:tcBorders>
+              <w:top w:val="single" w:color="E2E8F0" w:sz="1"/>
+              <w:left w:val="single" w:color="E2E8F0" w:sz="1"/>
+              <w:bottom w:val="single" w:color="E2E8F0" w:sz="1"/>
+              <w:right w:val="single" w:color="E2E8F0" w:sz="1"/>
+            </w:tcBorders>
+            <w:tcMar>
+              <w:top w:type="dxa" w:w="60"/>
+              <w:left w:type="dxa" w:w="100"/>
+              <w:bottom w:type="dxa" w:w="60"/>
+              <w:right w:type="dxa" w:w="100"/>
+            </w:tcMar>
+            <w:vAlign w:val="center"/>
+          </w:tcPr>
+          <w:p>
+            <w:pPr>
+              <w:spacing w:after="120" w:line="276"/>
+            </w:pPr>
+            <w:r>
+              <w:rPr>
+                <w:rFonts w:ascii="Arial" w:cs="Arial" w:eastAsia="Arial" w:hAnsi="Arial"/>
+                <w:color w:val="1E293B"/>
+                <w:sz w:val="21"/>
+                <w:szCs w:val="21"/>
+              </w:rPr>
+              <w:t xml:space="preserve">Cegah agar tidak telat</w:t>
+            </w:r>
+          </w:p>
+        </w:tc>
+      </w:tr>
+      <w:tr>
+        <w:tc>
+          <w:tcPr>
+            <w:tcW w:type="dxa" w:w="3120"/>
+            <w:tcBorders>
+              <w:top w:val="single" w:color="E2E8F0" w:sz="1"/>
+              <w:left w:val="single" w:color="E2E8F0" w:sz="1"/>
+              <w:bottom w:val="single" w:color="E2E8F0" w:sz="1"/>
+              <w:right w:val="single" w:color="E2E8F0" w:sz="1"/>
+            </w:tcBorders>
+            <w:shd w:fill="F0FDFA" w:val="clear"/>
+            <w:tcMar>
+              <w:top w:type="dxa" w:w="60"/>
+              <w:left w:type="dxa" w:w="100"/>
+              <w:bottom w:type="dxa" w:w="60"/>
+              <w:right w:type="dxa" w:w="100"/>
+            </w:tcMar>
+            <w:vAlign w:val="center"/>
+          </w:tcPr>
+          <w:p>
+            <w:pPr>
+              <w:spacing w:after="120" w:line="276"/>
+            </w:pPr>
+            <w:r>
+              <w:rPr>
+                <w:rFonts w:ascii="Arial" w:cs="Arial" w:eastAsia="Arial" w:hAnsi="Arial"/>
+                <w:b/>
+                <w:bCs/>
+                <w:color w:val="1E293B"/>
+                <w:sz w:val="21"/>
+                <w:szCs w:val="21"/>
+              </w:rPr>
+              <w:t xml:space="preserve">Dampak</w:t>
+            </w:r>
+          </w:p>
+        </w:tc>
+        <w:tc>
+          <w:tcPr>
+            <w:tcW w:type="dxa" w:w="3120"/>
+            <w:tcBorders>
+              <w:top w:val="single" w:color="E2E8F0" w:sz="1"/>
+              <w:left w:val="single" w:color="E2E8F0" w:sz="1"/>
+              <w:bottom w:val="single" w:color="E2E8F0" w:sz="1"/>
+              <w:right w:val="single" w:color="E2E8F0" w:sz="1"/>
+            </w:tcBorders>
+            <w:tcMar>
+              <w:top w:type="dxa" w:w="60"/>
+              <w:left w:type="dxa" w:w="100"/>
+              <w:bottom w:type="dxa" w:w="60"/>
+              <w:right w:type="dxa" w:w="100"/>
+            </w:tcMar>
+            <w:vAlign w:val="center"/>
+          </w:tcPr>
+          <w:p>
+            <w:pPr>
+              <w:spacing w:after="120" w:line="276"/>
+            </w:pPr>
+            <w:r>
+              <w:rPr>
+                <w:rFonts w:ascii="Arial" w:cs="Arial" w:eastAsia="Arial" w:hAnsi="Arial"/>
+                <w:color w:val="1E293B"/>
+                <w:sz w:val="21"/>
+                <w:szCs w:val="21"/>
+              </w:rPr>
+              <w:t xml:space="preserve">Stres, panik, depresi</w:t>
+            </w:r>
+          </w:p>
+        </w:tc>
+        <w:tc>
+          <w:tcPr>
+            <w:tcW w:type="dxa" w:w="3120"/>
+            <w:tcBorders>
+              <w:top w:val="single" w:color="E2E8F0" w:sz="1"/>
+              <w:left w:val="single" w:color="E2E8F0" w:sz="1"/>
+              <w:bottom w:val="single" w:color="E2E8F0" w:sz="1"/>
+              <w:right w:val="single" w:color="E2E8F0" w:sz="1"/>
+            </w:tcBorders>
+            <w:tcMar>
+              <w:top w:type="dxa" w:w="60"/>
+              <w:left w:type="dxa" w:w="100"/>
+              <w:bottom w:type="dxa" w:w="60"/>
+              <w:right w:type="dxa" w:w="100"/>
+            </w:tcMar>
+            <w:vAlign w:val="center"/>
+          </w:tcPr>
+          <w:p>
+            <w:pPr>
+              <w:spacing w:after="120" w:line="276"/>
+            </w:pPr>
+            <w:r>
+              <w:rPr>
+                <w:rFonts w:ascii="Arial" w:cs="Arial" w:eastAsia="Arial" w:hAnsi="Arial"/>
+                <w:color w:val="1E293B"/>
+                <w:sz w:val="21"/>
+                <w:szCs w:val="21"/>
+              </w:rPr>
+              <w:t xml:space="preserve">Tenang, tau gambaran utuh</w:t>
+            </w:r>
+          </w:p>
+        </w:tc>
+      </w:tr>
+    </w:tbl>
+    <w:p>
+      <w:pPr>
+        <w:spacing w:after="60"/>
+      </w:pPr>
+    </w:p>
+    <w:p>
+      <w:pPr>
+        <w:spacing w:after="120" w:line="276"/>
+      </w:pPr>
+      <w:r>
+        <w:rPr>
+          <w:rFonts w:ascii="Arial" w:cs="Arial" w:eastAsia="Arial" w:hAnsi="Arial"/>
+          <w:b/>
+          <w:bCs/>
+          <w:color w:val="1E293B"/>
+          <w:sz w:val="21"/>
+          <w:szCs w:val="21"/>
+        </w:rPr>
+        <w:t xml:space="preserve">JatuhTempo tidak menambah tekanan. Sebaliknya, JatuhTempo mengembalikan kontrol ke tangan user — dengan memberikan gambaran utuh, reminder sebelum telat, dan strategi keluar. Orang stres bukan karena tahu utangnya, tapi karena TIDAK TAHU — berapa total, mana yang harus dibayar duluan, kapan jatuh tempo. JatuhTempo menjawab semua itu.</w:t>
       </w:r>
     </w:p>
     <w:p>

</xml_diff>